<commit_message>
Minor tweaks and fixes
</commit_message>
<xml_diff>
--- a/assets/docs/user-manual/user-manual.docx
+++ b/assets/docs/user-manual/user-manual.docx
@@ -6,9 +6,7 @@
       <w:pPr>
         <w:jc w:val="center"/>
         <w:rPr>
-          <w:rFonts w:ascii="Futura" w:hAnsi="Futura"/>
-          <w:b/>
-          <w:bCs/>
+          <w:rFonts w:ascii="Futura Std Book" w:hAnsi="Futura Std Book"/>
           <w:sz w:val="52"/>
           <w:szCs w:val="52"/>
         </w:rPr>
@@ -18,9 +16,7 @@
       <w:pPr>
         <w:jc w:val="center"/>
         <w:rPr>
-          <w:rFonts w:ascii="Futura" w:hAnsi="Futura"/>
-          <w:b/>
-          <w:bCs/>
+          <w:rFonts w:ascii="Futura Std Book" w:hAnsi="Futura Std Book"/>
           <w:sz w:val="52"/>
           <w:szCs w:val="52"/>
         </w:rPr>
@@ -30,9 +26,7 @@
       <w:pPr>
         <w:jc w:val="center"/>
         <w:rPr>
-          <w:rFonts w:ascii="Futura" w:hAnsi="Futura"/>
-          <w:b/>
-          <w:bCs/>
+          <w:rFonts w:ascii="Futura Std Book" w:hAnsi="Futura Std Book"/>
           <w:sz w:val="52"/>
           <w:szCs w:val="52"/>
         </w:rPr>
@@ -42,200 +36,141 @@
       <w:pPr>
         <w:jc w:val="center"/>
         <w:rPr>
-          <w:rFonts w:ascii="Futura" w:hAnsi="Futura"/>
-          <w:b/>
-          <w:bCs/>
+          <w:rFonts w:ascii="Futura Std Book" w:hAnsi="Futura Std Book"/>
           <w:sz w:val="52"/>
           <w:szCs w:val="52"/>
         </w:rPr>
       </w:pPr>
-    </w:p>
-    <w:p>
-      <w:pPr>
-        <w:jc w:val="center"/>
-        <w:rPr>
-          <w:rFonts w:ascii="Futura" w:hAnsi="Futura"/>
-          <w:b/>
-          <w:bCs/>
+      <w:r>
+        <w:rPr>
+          <w:rFonts w:ascii="Futura Std Book" w:hAnsi="Futura Std Book"/>
+          <w:sz w:val="72"/>
+          <w:szCs w:val="72"/>
+        </w:rPr>
+        <w:t xml:space="preserve">HEPC-NetPulse: </w:t>
+      </w:r>
+      <w:r>
+        <w:rPr>
+          <w:rFonts w:ascii="Futura Std Book" w:hAnsi="Futura Std Book"/>
           <w:sz w:val="52"/>
           <w:szCs w:val="52"/>
         </w:rPr>
-      </w:pPr>
-      <w:r>
-        <w:rPr>
-          <w:rFonts w:ascii="Futura" w:hAnsi="Futura"/>
-          <w:b/>
-          <w:bCs/>
-          <w:sz w:val="72"/>
-          <w:szCs w:val="72"/>
-        </w:rPr>
-        <w:t xml:space="preserve">HEPC-NetPulse: </w:t>
-      </w:r>
-      <w:r>
-        <w:rPr>
-          <w:rFonts w:ascii="Futura" w:hAnsi="Futura"/>
-          <w:b/>
-          <w:bCs/>
+        <w:br/>
+        <w:t>IT Administrator</w:t>
+      </w:r>
+      <w:r>
+        <w:rPr>
+          <w:rFonts w:ascii="Futura Std Book" w:hAnsi="Futura Std Book"/>
           <w:sz w:val="52"/>
           <w:szCs w:val="52"/>
         </w:rPr>
-        <w:br/>
-        <w:t>IT Administrator</w:t>
-      </w:r>
-      <w:r>
-        <w:rPr>
-          <w:rFonts w:ascii="Futura" w:hAnsi="Futura"/>
-          <w:b/>
-          <w:bCs/>
+        <w:t xml:space="preserve"> </w:t>
+      </w:r>
+      <w:r>
+        <w:rPr>
+          <w:rFonts w:ascii="Futura Std Book" w:hAnsi="Futura Std Book"/>
           <w:sz w:val="52"/>
           <w:szCs w:val="52"/>
         </w:rPr>
-        <w:t xml:space="preserve"> </w:t>
-      </w:r>
-      <w:r>
-        <w:rPr>
-          <w:rFonts w:ascii="Futura" w:hAnsi="Futura"/>
-          <w:b/>
-          <w:bCs/>
+        <w:t xml:space="preserve">&amp; User </w:t>
+      </w:r>
+      <w:r>
+        <w:rPr>
+          <w:rFonts w:ascii="Futura Std Book" w:hAnsi="Futura Std Book"/>
           <w:sz w:val="52"/>
           <w:szCs w:val="52"/>
         </w:rPr>
-        <w:t xml:space="preserve">&amp; User </w:t>
-      </w:r>
-      <w:r>
-        <w:rPr>
-          <w:rFonts w:ascii="Futura" w:hAnsi="Futura"/>
-          <w:b/>
-          <w:bCs/>
-          <w:sz w:val="52"/>
-          <w:szCs w:val="52"/>
-        </w:rPr>
         <w:t>Manual</w:t>
       </w:r>
     </w:p>
     <w:p>
       <w:pPr>
         <w:rPr>
-          <w:rFonts w:ascii="Futura" w:hAnsi="Futura"/>
-          <w:b/>
-          <w:bCs/>
-        </w:rPr>
-      </w:pPr>
-    </w:p>
-    <w:p>
-      <w:pPr>
-        <w:rPr>
-          <w:rFonts w:ascii="Futura" w:hAnsi="Futura"/>
-          <w:b/>
-          <w:bCs/>
-        </w:rPr>
-      </w:pPr>
-    </w:p>
-    <w:p>
-      <w:pPr>
-        <w:rPr>
-          <w:rFonts w:ascii="Futura" w:hAnsi="Futura"/>
-          <w:b/>
-          <w:bCs/>
-        </w:rPr>
-      </w:pPr>
-    </w:p>
-    <w:p>
-      <w:pPr>
-        <w:rPr>
-          <w:rFonts w:ascii="Futura" w:hAnsi="Futura"/>
-          <w:b/>
-          <w:bCs/>
-        </w:rPr>
-      </w:pPr>
-    </w:p>
-    <w:p>
-      <w:pPr>
-        <w:rPr>
-          <w:rFonts w:ascii="Futura" w:hAnsi="Futura"/>
-          <w:b/>
-          <w:bCs/>
-        </w:rPr>
-      </w:pPr>
-    </w:p>
-    <w:p>
-      <w:pPr>
-        <w:rPr>
-          <w:rFonts w:ascii="Futura" w:hAnsi="Futura"/>
-          <w:b/>
-          <w:bCs/>
-        </w:rPr>
-      </w:pPr>
-    </w:p>
-    <w:p>
-      <w:pPr>
-        <w:rPr>
-          <w:rFonts w:ascii="Futura" w:hAnsi="Futura"/>
-          <w:b/>
-          <w:bCs/>
-        </w:rPr>
-      </w:pPr>
-    </w:p>
-    <w:p>
-      <w:pPr>
-        <w:rPr>
-          <w:rFonts w:ascii="Futura" w:hAnsi="Futura"/>
-          <w:b/>
-          <w:bCs/>
-        </w:rPr>
-      </w:pPr>
-    </w:p>
-    <w:p>
-      <w:pPr>
-        <w:rPr>
-          <w:rFonts w:ascii="Futura" w:hAnsi="Futura"/>
-          <w:b/>
-          <w:bCs/>
-        </w:rPr>
-      </w:pPr>
-    </w:p>
-    <w:p>
-      <w:pPr>
-        <w:rPr>
-          <w:rFonts w:ascii="Futura" w:hAnsi="Futura"/>
-          <w:b/>
-          <w:bCs/>
-        </w:rPr>
-      </w:pPr>
-    </w:p>
-    <w:p>
-      <w:pPr>
-        <w:rPr>
-          <w:rFonts w:ascii="Futura" w:hAnsi="Futura"/>
-          <w:b/>
-          <w:bCs/>
-        </w:rPr>
-      </w:pPr>
-    </w:p>
-    <w:p>
-      <w:pPr>
-        <w:rPr>
-          <w:rFonts w:ascii="Futura" w:hAnsi="Futura"/>
-          <w:b/>
-          <w:bCs/>
-        </w:rPr>
-      </w:pPr>
-    </w:p>
-    <w:p>
-      <w:pPr>
-        <w:rPr>
-          <w:rFonts w:ascii="Futura" w:hAnsi="Futura"/>
-          <w:b/>
-          <w:bCs/>
-        </w:rPr>
-      </w:pPr>
-    </w:p>
-    <w:p>
-      <w:pPr>
-        <w:rPr>
-          <w:rFonts w:ascii="Futura" w:hAnsi="Futura"/>
-          <w:b/>
-          <w:bCs/>
+          <w:rFonts w:ascii="Futura Std Book" w:hAnsi="Futura Std Book"/>
+        </w:rPr>
+      </w:pPr>
+    </w:p>
+    <w:p>
+      <w:pPr>
+        <w:rPr>
+          <w:rFonts w:ascii="Futura Std Book" w:hAnsi="Futura Std Book"/>
+        </w:rPr>
+      </w:pPr>
+    </w:p>
+    <w:p>
+      <w:pPr>
+        <w:rPr>
+          <w:rFonts w:ascii="Futura Std Book" w:hAnsi="Futura Std Book"/>
+        </w:rPr>
+      </w:pPr>
+    </w:p>
+    <w:p>
+      <w:pPr>
+        <w:rPr>
+          <w:rFonts w:ascii="Futura Std Book" w:hAnsi="Futura Std Book"/>
+        </w:rPr>
+      </w:pPr>
+    </w:p>
+    <w:p>
+      <w:pPr>
+        <w:rPr>
+          <w:rFonts w:ascii="Futura Std Book" w:hAnsi="Futura Std Book"/>
+        </w:rPr>
+      </w:pPr>
+    </w:p>
+    <w:p>
+      <w:pPr>
+        <w:rPr>
+          <w:rFonts w:ascii="Futura Std Book" w:hAnsi="Futura Std Book"/>
+        </w:rPr>
+      </w:pPr>
+    </w:p>
+    <w:p>
+      <w:pPr>
+        <w:rPr>
+          <w:rFonts w:ascii="Futura Std Book" w:hAnsi="Futura Std Book"/>
+        </w:rPr>
+      </w:pPr>
+    </w:p>
+    <w:p>
+      <w:pPr>
+        <w:rPr>
+          <w:rFonts w:ascii="Futura Std Book" w:hAnsi="Futura Std Book"/>
+        </w:rPr>
+      </w:pPr>
+    </w:p>
+    <w:p>
+      <w:pPr>
+        <w:rPr>
+          <w:rFonts w:ascii="Futura Std Book" w:hAnsi="Futura Std Book"/>
+        </w:rPr>
+      </w:pPr>
+    </w:p>
+    <w:p>
+      <w:pPr>
+        <w:rPr>
+          <w:rFonts w:ascii="Futura Std Book" w:hAnsi="Futura Std Book"/>
+        </w:rPr>
+      </w:pPr>
+    </w:p>
+    <w:p>
+      <w:pPr>
+        <w:rPr>
+          <w:rFonts w:ascii="Futura Std Book" w:hAnsi="Futura Std Book"/>
+        </w:rPr>
+      </w:pPr>
+    </w:p>
+    <w:p>
+      <w:pPr>
+        <w:rPr>
+          <w:rFonts w:ascii="Futura Std Book" w:hAnsi="Futura Std Book"/>
+        </w:rPr>
+      </w:pPr>
+    </w:p>
+    <w:p>
+      <w:pPr>
+        <w:rPr>
+          <w:rFonts w:ascii="Futura Std Book" w:hAnsi="Futura Std Book"/>
         </w:rPr>
       </w:pPr>
     </w:p>
@@ -243,44 +178,36 @@
       <w:pPr>
         <w:jc w:val="center"/>
         <w:rPr>
-          <w:rFonts w:ascii="Futura" w:hAnsi="Futura"/>
-        </w:rPr>
-      </w:pPr>
-      <w:r>
-        <w:rPr>
-          <w:rFonts w:ascii="Futura" w:hAnsi="Futura"/>
-          <w:b/>
-          <w:bCs/>
-        </w:rPr>
-        <w:t>Prepared By:</w:t>
-      </w:r>
-      <w:r>
-        <w:rPr>
-          <w:rFonts w:ascii="Futura" w:hAnsi="Futura"/>
-        </w:rPr>
-        <w:t xml:space="preserve"> </w:t>
-      </w:r>
-      <w:r>
-        <w:rPr>
-          <w:rFonts w:ascii="Futura" w:hAnsi="Futura"/>
+          <w:rFonts w:ascii="Futura Std Book" w:hAnsi="Futura Std Book"/>
+        </w:rPr>
+      </w:pPr>
+      <w:r>
+        <w:rPr>
+          <w:rFonts w:ascii="Futura Std Book" w:hAnsi="Futura Std Book"/>
+        </w:rPr>
+        <w:t xml:space="preserve">Prepared By: </w:t>
+      </w:r>
+      <w:r>
+        <w:rPr>
+          <w:rFonts w:ascii="Futura Std Book" w:hAnsi="Futura Std Book"/>
         </w:rPr>
         <w:br/>
       </w:r>
       <w:r>
         <w:rPr>
-          <w:rFonts w:ascii="Futura" w:hAnsi="Futura"/>
+          <w:rFonts w:ascii="Futura Std Book" w:hAnsi="Futura Std Book"/>
         </w:rPr>
         <w:t>Mariquit, Lance Joseph J.</w:t>
       </w:r>
       <w:r>
         <w:rPr>
-          <w:rFonts w:ascii="Futura" w:hAnsi="Futura"/>
+          <w:rFonts w:ascii="Futura Std Book" w:hAnsi="Futura Std Book"/>
         </w:rPr>
         <w:br/>
       </w:r>
       <w:r>
         <w:rPr>
-          <w:rFonts w:ascii="Futura" w:hAnsi="Futura"/>
+          <w:rFonts w:ascii="Futura Std Book" w:hAnsi="Futura Std Book"/>
         </w:rPr>
         <w:t>IT OJT STAFF</w:t>
       </w:r>
@@ -288,74 +215,62 @@
     <w:p>
       <w:pPr>
         <w:rPr>
-          <w:rFonts w:ascii="Futura" w:hAnsi="Futura"/>
-          <w:b/>
-          <w:bCs/>
-        </w:rPr>
-      </w:pPr>
-    </w:p>
-    <w:p>
-      <w:pPr>
-        <w:rPr>
-          <w:rFonts w:ascii="Futura" w:hAnsi="Futura"/>
-          <w:b/>
-          <w:bCs/>
-        </w:rPr>
-      </w:pPr>
-    </w:p>
-    <w:p>
-      <w:pPr>
-        <w:rPr>
-          <w:rFonts w:ascii="Futura" w:hAnsi="Futura"/>
-          <w:b/>
-          <w:bCs/>
-        </w:rPr>
-      </w:pPr>
-    </w:p>
-    <w:p>
-      <w:pPr>
-        <w:rPr>
-          <w:rFonts w:ascii="Futura" w:hAnsi="Futura"/>
-          <w:b/>
-          <w:bCs/>
-        </w:rPr>
-      </w:pPr>
-    </w:p>
-    <w:p>
-      <w:pPr>
-        <w:rPr>
-          <w:rFonts w:ascii="Futura" w:hAnsi="Futura"/>
-          <w:b/>
-          <w:bCs/>
-        </w:rPr>
-      </w:pPr>
-    </w:p>
-    <w:p>
-      <w:pPr>
-        <w:jc w:val="both"/>
-        <w:rPr>
-          <w:rFonts w:ascii="Futura" w:hAnsi="Futura"/>
-        </w:rPr>
-      </w:pPr>
-    </w:p>
-    <w:p>
-      <w:pPr>
-        <w:jc w:val="both"/>
-        <w:rPr>
-          <w:rFonts w:ascii="Futura" w:hAnsi="Futura"/>
-          <w:b/>
-          <w:bCs/>
+          <w:rFonts w:ascii="Futura Std Book" w:hAnsi="Futura Std Book"/>
+        </w:rPr>
+      </w:pPr>
+    </w:p>
+    <w:p>
+      <w:pPr>
+        <w:rPr>
+          <w:rFonts w:ascii="Futura Std Book" w:hAnsi="Futura Std Book"/>
+        </w:rPr>
+      </w:pPr>
+    </w:p>
+    <w:p>
+      <w:pPr>
+        <w:rPr>
+          <w:rFonts w:ascii="Futura Std Book" w:hAnsi="Futura Std Book"/>
+        </w:rPr>
+      </w:pPr>
+    </w:p>
+    <w:p>
+      <w:pPr>
+        <w:rPr>
+          <w:rFonts w:ascii="Futura Std Book" w:hAnsi="Futura Std Book"/>
+        </w:rPr>
+      </w:pPr>
+    </w:p>
+    <w:p>
+      <w:pPr>
+        <w:rPr>
+          <w:rFonts w:ascii="Futura Std Book" w:hAnsi="Futura Std Book"/>
+        </w:rPr>
+      </w:pPr>
+    </w:p>
+    <w:p>
+      <w:pPr>
+        <w:jc w:val="both"/>
+        <w:rPr>
+          <w:rFonts w:ascii="Futura Std Book" w:hAnsi="Futura Std Book"/>
+        </w:rPr>
+      </w:pPr>
+    </w:p>
+    <w:p>
+      <w:pPr>
+        <w:jc w:val="both"/>
+        <w:rPr>
+          <w:rFonts w:ascii="Futura Std Book" w:hAnsi="Futura Std Book"/>
           <w:sz w:val="32"/>
           <w:szCs w:val="32"/>
         </w:rPr>
       </w:pPr>
       <w:r>
         <w:rPr>
-          <w:rFonts w:ascii="Futura" w:hAnsi="Futura"/>
+          <w:rFonts w:ascii="Futura Std Book" w:hAnsi="Futura Std Book"/>
         </w:rPr>
         <w:lastRenderedPageBreak/>
         <w:pict w14:anchorId="1B9A71AD">
-          <v:rect id="_x0000_i1025" style="width:0;height:1.5pt" o:hralign="center" o:hrstd="t" o:hr="t" fillcolor="#a0a0a0" stroked="f"/>
+          <v:rect id="_x0000_i1097" style="width:0;height:1.5pt" o:hralign="center" o:hrstd="t" o:hr="t" fillcolor="#a0a0a0" stroked="f"/>
         </w:pict>
       </w:r>
     </w:p>
@@ -363,18 +278,14 @@
       <w:pPr>
         <w:jc w:val="both"/>
         <w:rPr>
-          <w:rFonts w:ascii="Futura" w:hAnsi="Futura"/>
-          <w:b/>
-          <w:bCs/>
+          <w:rFonts w:ascii="Futura Std Book" w:hAnsi="Futura Std Book"/>
           <w:sz w:val="32"/>
           <w:szCs w:val="32"/>
         </w:rPr>
       </w:pPr>
       <w:r>
         <w:rPr>
-          <w:rFonts w:ascii="Futura" w:hAnsi="Futura"/>
-          <w:b/>
-          <w:bCs/>
+          <w:rFonts w:ascii="Futura Std Book" w:hAnsi="Futura Std Book"/>
           <w:sz w:val="32"/>
           <w:szCs w:val="32"/>
         </w:rPr>
@@ -385,32 +296,24 @@
       <w:pPr>
         <w:jc w:val="both"/>
         <w:rPr>
-          <w:rFonts w:ascii="Futura" w:hAnsi="Futura"/>
-        </w:rPr>
-      </w:pPr>
-      <w:r>
-        <w:rPr>
-          <w:rFonts w:ascii="Futura" w:hAnsi="Futura"/>
-          <w:b/>
-          <w:bCs/>
-        </w:rPr>
-        <w:t>HEPC-NetPulse</w:t>
-      </w:r>
-      <w:r>
-        <w:rPr>
-          <w:rFonts w:ascii="Futura" w:hAnsi="Futura"/>
-        </w:rPr>
-        <w:t xml:space="preserve"> is a dedicated network monitoring </w:t>
-      </w:r>
-      <w:r>
-        <w:rPr>
-          <w:rFonts w:ascii="Futura" w:hAnsi="Futura"/>
+          <w:rFonts w:ascii="Futura Std Book" w:hAnsi="Futura Std Book"/>
+        </w:rPr>
+      </w:pPr>
+      <w:r>
+        <w:rPr>
+          <w:rFonts w:ascii="Futura Std Book" w:hAnsi="Futura Std Book"/>
+        </w:rPr>
+        <w:t xml:space="preserve">HEPC-NetPulse is a dedicated network monitoring </w:t>
+      </w:r>
+      <w:r>
+        <w:rPr>
+          <w:rFonts w:ascii="Futura Std Book" w:hAnsi="Futura Std Book"/>
         </w:rPr>
         <w:t>system</w:t>
       </w:r>
       <w:r>
         <w:rPr>
-          <w:rFonts w:ascii="Futura" w:hAnsi="Futura"/>
+          <w:rFonts w:ascii="Futura Std Book" w:hAnsi="Futura Std Book"/>
         </w:rPr>
         <w:t xml:space="preserve"> for Hayakawa Electronics (PHILS.) Corp. It provides real-time visibility into tracking latency (ms) and connectivity status for servers, switches, biometrics, and workstations.</w:t>
       </w:r>
@@ -419,15 +322,15 @@
       <w:pPr>
         <w:jc w:val="both"/>
         <w:rPr>
-          <w:rFonts w:ascii="Futura" w:hAnsi="Futura"/>
-        </w:rPr>
-      </w:pPr>
-      <w:r>
-        <w:rPr>
-          <w:rFonts w:ascii="Futura" w:hAnsi="Futura"/>
+          <w:rFonts w:ascii="Futura Std Book" w:hAnsi="Futura Std Book"/>
+        </w:rPr>
+      </w:pPr>
+      <w:r>
+        <w:rPr>
+          <w:rFonts w:ascii="Futura Std Book" w:hAnsi="Futura Std Book"/>
         </w:rPr>
         <w:pict w14:anchorId="7BCDE0EC">
-          <v:rect id="_x0000_i1026" style="width:0;height:1.5pt" o:hralign="center" o:hrstd="t" o:hr="t" fillcolor="#a0a0a0" stroked="f"/>
+          <v:rect id="_x0000_i1098" style="width:0;height:1.5pt" o:hralign="center" o:hrstd="t" o:hr="t" fillcolor="#a0a0a0" stroked="f"/>
         </w:pict>
       </w:r>
     </w:p>
@@ -435,18 +338,14 @@
       <w:pPr>
         <w:jc w:val="both"/>
         <w:rPr>
-          <w:rFonts w:ascii="Futura" w:hAnsi="Futura"/>
-          <w:b/>
-          <w:bCs/>
+          <w:rFonts w:ascii="Futura Std Book" w:hAnsi="Futura Std Book"/>
           <w:sz w:val="32"/>
           <w:szCs w:val="40"/>
         </w:rPr>
       </w:pPr>
       <w:r>
         <w:rPr>
-          <w:rFonts w:ascii="Futura" w:hAnsi="Futura"/>
-          <w:b/>
-          <w:bCs/>
+          <w:rFonts w:ascii="Futura Std Book" w:hAnsi="Futura Std Book"/>
           <w:sz w:val="32"/>
           <w:szCs w:val="40"/>
         </w:rPr>
@@ -457,12 +356,12 @@
       <w:pPr>
         <w:jc w:val="both"/>
         <w:rPr>
-          <w:rFonts w:ascii="Futura" w:hAnsi="Futura"/>
-        </w:rPr>
-      </w:pPr>
-      <w:r>
-        <w:rPr>
-          <w:rFonts w:ascii="Futura" w:hAnsi="Futura"/>
+          <w:rFonts w:ascii="Futura Std Book" w:hAnsi="Futura Std Book"/>
+        </w:rPr>
+      </w:pPr>
+      <w:r>
+        <w:rPr>
+          <w:rFonts w:ascii="Futura Std Book" w:hAnsi="Futura Std Book"/>
         </w:rPr>
         <w:t>The system is designed for a "Plug-and-Play" deployment. You do not need to manually create a database or import .sql files.</w:t>
       </w:r>
@@ -471,16 +370,12 @@
       <w:pPr>
         <w:jc w:val="both"/>
         <w:rPr>
-          <w:rFonts w:ascii="Futura" w:hAnsi="Futura"/>
-          <w:b/>
-          <w:bCs/>
-        </w:rPr>
-      </w:pPr>
-      <w:r>
-        <w:rPr>
-          <w:rFonts w:ascii="Futura" w:hAnsi="Futura"/>
-          <w:b/>
-          <w:bCs/>
+          <w:rFonts w:ascii="Futura Std Book" w:hAnsi="Futura Std Book"/>
+        </w:rPr>
+      </w:pPr>
+      <w:r>
+        <w:rPr>
+          <w:rFonts w:ascii="Futura Std Book" w:hAnsi="Futura Std Book"/>
         </w:rPr>
         <w:t>Deployment Steps:</w:t>
       </w:r>
@@ -493,36 +388,14 @@
         </w:numPr>
         <w:jc w:val="both"/>
         <w:rPr>
-          <w:rFonts w:ascii="Futura" w:hAnsi="Futura"/>
-        </w:rPr>
-      </w:pPr>
-      <w:r>
-        <w:rPr>
-          <w:rFonts w:ascii="Futura" w:hAnsi="Futura"/>
-          <w:b/>
-          <w:bCs/>
-        </w:rPr>
-        <w:t>Server Requirements:</w:t>
-      </w:r>
-      <w:r>
-        <w:rPr>
-          <w:rFonts w:ascii="Futura" w:hAnsi="Futura"/>
-        </w:rPr>
-        <w:t xml:space="preserve"> Ensure the target server has </w:t>
-      </w:r>
-      <w:r>
-        <w:rPr>
-          <w:rFonts w:ascii="Futura" w:hAnsi="Futura"/>
-          <w:b/>
-          <w:bCs/>
-        </w:rPr>
-        <w:t>XAMPP</w:t>
-      </w:r>
-      <w:r>
-        <w:rPr>
-          <w:rFonts w:ascii="Futura" w:hAnsi="Futura"/>
-        </w:rPr>
-        <w:t xml:space="preserve"> (or an Apache/MySQL stack) installed.</w:t>
+          <w:rFonts w:ascii="Futura Std Book" w:hAnsi="Futura Std Book"/>
+        </w:rPr>
+      </w:pPr>
+      <w:r>
+        <w:rPr>
+          <w:rFonts w:ascii="Futura Std Book" w:hAnsi="Futura Std Book"/>
+        </w:rPr>
+        <w:t>Server Requirements: Ensure the target server has XAMPP (or an Apache/MySQL stack) installed.</w:t>
       </w:r>
     </w:p>
     <w:p>
@@ -533,32 +406,24 @@
         </w:numPr>
         <w:jc w:val="both"/>
         <w:rPr>
-          <w:rFonts w:ascii="Futura" w:hAnsi="Futura"/>
-        </w:rPr>
-      </w:pPr>
-      <w:r>
-        <w:rPr>
-          <w:rFonts w:ascii="Futura" w:hAnsi="Futura"/>
-          <w:b/>
-          <w:bCs/>
-        </w:rPr>
-        <w:t>File Placement:</w:t>
-      </w:r>
-      <w:r>
-        <w:rPr>
-          <w:rFonts w:ascii="Futura" w:hAnsi="Futura"/>
-        </w:rPr>
-        <w:t xml:space="preserve"> Copy the </w:t>
-      </w:r>
-      <w:r>
-        <w:rPr>
-          <w:rFonts w:ascii="Futura" w:hAnsi="Futura"/>
+          <w:rFonts w:ascii="Futura Std Book" w:hAnsi="Futura Std Book"/>
+        </w:rPr>
+      </w:pPr>
+      <w:r>
+        <w:rPr>
+          <w:rFonts w:ascii="Futura Std Book" w:hAnsi="Futura Std Book"/>
+        </w:rPr>
+        <w:t xml:space="preserve">File Placement: Copy the </w:t>
+      </w:r>
+      <w:r>
+        <w:rPr>
+          <w:rFonts w:ascii="Futura Std Book" w:hAnsi="Futura Std Book"/>
         </w:rPr>
         <w:t>project</w:t>
       </w:r>
       <w:r>
         <w:rPr>
-          <w:rFonts w:ascii="Futura" w:hAnsi="Futura"/>
+          <w:rFonts w:ascii="Futura Std Book" w:hAnsi="Futura Std Book"/>
         </w:rPr>
         <w:t xml:space="preserve"> folder into the htdocs directory of your XAMPP installation.</w:t>
       </w:r>
@@ -571,99 +436,83 @@
         </w:numPr>
         <w:jc w:val="both"/>
         <w:rPr>
-          <w:rFonts w:ascii="Futura" w:hAnsi="Futura"/>
-        </w:rPr>
-      </w:pPr>
-      <w:r>
-        <w:rPr>
-          <w:rFonts w:ascii="Futura" w:hAnsi="Futura"/>
-          <w:b/>
-          <w:bCs/>
-        </w:rPr>
-        <w:t>Automatic Database Setup:</w:t>
-      </w:r>
-      <w:r>
-        <w:rPr>
-          <w:rFonts w:ascii="Futura" w:hAnsi="Futura"/>
+          <w:rFonts w:ascii="Futura Std Book" w:hAnsi="Futura Std Book"/>
+        </w:rPr>
+      </w:pPr>
+      <w:r>
+        <w:rPr>
+          <w:rFonts w:ascii="Futura Std Book" w:hAnsi="Futura Std Book"/>
+        </w:rPr>
+        <w:t xml:space="preserve">Automatic Database Setup: </w:t>
+      </w:r>
+    </w:p>
+    <w:p>
+      <w:pPr>
+        <w:ind w:left="720"/>
+        <w:jc w:val="both"/>
+        <w:rPr>
+          <w:rFonts w:ascii="Futura Std Book" w:hAnsi="Futura Std Book"/>
+        </w:rPr>
+      </w:pPr>
+      <w:r>
+        <w:rPr>
+          <w:rFonts w:ascii="Futura Std Book" w:hAnsi="Futura Std Book"/>
+        </w:rPr>
+        <w:t xml:space="preserve">* Open your browser and navigate to the </w:t>
+      </w:r>
+      <w:r>
+        <w:rPr>
+          <w:rFonts w:ascii="Futura Std Book" w:hAnsi="Futura Std Book"/>
+        </w:rPr>
+        <w:t>system url</w:t>
+      </w:r>
+      <w:r>
+        <w:rPr>
+          <w:rFonts w:ascii="Futura Std Book" w:hAnsi="Futura Std Book"/>
+        </w:rPr>
+        <w:t xml:space="preserve"> (e.g., </w:t>
+      </w:r>
+      <w:r>
+        <w:rPr>
+          <w:rFonts w:ascii="Futura Std Book" w:hAnsi="Futura Std Book"/>
+          <w:i/>
+          <w:iCs/>
+        </w:rPr>
+        <w:t>localhost</w:t>
+      </w:r>
+      <w:r>
+        <w:rPr>
+          <w:rFonts w:ascii="Futura Std Book" w:hAnsi="Futura Std Book"/>
+          <w:i/>
+          <w:iCs/>
+        </w:rPr>
+        <w:t>/net_pulse</w:t>
+      </w:r>
+      <w:r>
+        <w:rPr>
+          <w:rFonts w:ascii="Futura Std Book" w:hAnsi="Futura Std Book"/>
+          <w:i/>
+          <w:iCs/>
+        </w:rPr>
+        <w:t>/ logIn.php</w:t>
+      </w:r>
+      <w:r>
+        <w:rPr>
+          <w:rFonts w:ascii="Futura Std Book" w:hAnsi="Futura Std Book"/>
+          <w:i/>
+          <w:iCs/>
         </w:rPr>
         <w:t xml:space="preserve"> </w:t>
       </w:r>
-    </w:p>
-    <w:p>
-      <w:pPr>
-        <w:ind w:left="720"/>
-        <w:jc w:val="both"/>
-        <w:rPr>
-          <w:rFonts w:ascii="Futura" w:hAnsi="Futura"/>
-        </w:rPr>
-      </w:pPr>
-      <w:r>
-        <w:rPr>
-          <w:rFonts w:ascii="Futura" w:hAnsi="Futura"/>
-        </w:rPr>
-        <w:t xml:space="preserve">* Open your browser and navigate to the </w:t>
-      </w:r>
-      <w:r>
-        <w:rPr>
-          <w:rFonts w:ascii="Futura" w:hAnsi="Futura"/>
-        </w:rPr>
-        <w:t>system url</w:t>
-      </w:r>
-      <w:r>
-        <w:rPr>
-          <w:rFonts w:ascii="Futura" w:hAnsi="Futura"/>
-        </w:rPr>
-        <w:t xml:space="preserve"> (e.g., </w:t>
-      </w:r>
-      <w:r>
-        <w:rPr>
-          <w:rFonts w:ascii="Futura" w:hAnsi="Futura"/>
-          <w:b/>
-          <w:bCs/>
-          <w:i/>
-          <w:iCs/>
-        </w:rPr>
-        <w:t>localhost</w:t>
-      </w:r>
-      <w:r>
-        <w:rPr>
-          <w:rFonts w:ascii="Futura" w:hAnsi="Futura"/>
-          <w:b/>
-          <w:bCs/>
-          <w:i/>
-          <w:iCs/>
-        </w:rPr>
-        <w:t>/net_pulse</w:t>
-      </w:r>
-      <w:r>
-        <w:rPr>
-          <w:rFonts w:ascii="Futura" w:hAnsi="Futura"/>
-          <w:b/>
-          <w:bCs/>
-          <w:i/>
-          <w:iCs/>
-        </w:rPr>
-        <w:t>/ logIn.php</w:t>
-      </w:r>
-      <w:r>
-        <w:rPr>
-          <w:rFonts w:ascii="Futura" w:hAnsi="Futura"/>
-          <w:i/>
-          <w:iCs/>
-        </w:rPr>
-        <w:t xml:space="preserve"> </w:t>
-      </w:r>
-      <w:r>
-        <w:rPr>
-          <w:rFonts w:ascii="Futura" w:hAnsi="Futura"/>
+      <w:r>
+        <w:rPr>
+          <w:rFonts w:ascii="Futura Std Book" w:hAnsi="Futura Std Book"/>
         </w:rPr>
         <w:t xml:space="preserve">or </w:t>
       </w:r>
       <w:r>
         <w:rPr>
-          <w:rFonts w:ascii="Futura" w:hAnsi="Futura"/>
-          <w:b/>
-          <w:bCs/>
+          <w:rFonts w:ascii="Futura Std Book" w:hAnsi="Futura Std Book"/>
           <w:i/>
           <w:iCs/>
         </w:rPr>
@@ -671,9 +520,7 @@
       </w:r>
       <w:r>
         <w:rPr>
-          <w:rFonts w:ascii="Futura" w:hAnsi="Futura"/>
-          <w:b/>
-          <w:bCs/>
+          <w:rFonts w:ascii="Futura Std Book" w:hAnsi="Futura Std Book"/>
           <w:i/>
           <w:iCs/>
         </w:rPr>
@@ -681,9 +528,7 @@
       </w:r>
       <w:r>
         <w:rPr>
-          <w:rFonts w:ascii="Futura" w:hAnsi="Futura"/>
-          <w:b/>
-          <w:bCs/>
+          <w:rFonts w:ascii="Futura Std Book" w:hAnsi="Futura Std Book"/>
           <w:i/>
           <w:iCs/>
         </w:rPr>
@@ -691,9 +536,7 @@
       </w:r>
       <w:r>
         <w:rPr>
-          <w:rFonts w:ascii="Futura" w:hAnsi="Futura"/>
-          <w:b/>
-          <w:bCs/>
+          <w:rFonts w:ascii="Futura Std Book" w:hAnsi="Futura Std Book"/>
         </w:rPr>
         <w:t>).</w:t>
       </w:r>
@@ -706,12 +549,12 @@
         </w:numPr>
         <w:jc w:val="both"/>
         <w:rPr>
-          <w:rFonts w:ascii="Futura" w:hAnsi="Futura"/>
-        </w:rPr>
-      </w:pPr>
-      <w:r>
-        <w:rPr>
-          <w:rFonts w:ascii="Futura" w:hAnsi="Futura"/>
+          <w:rFonts w:ascii="Futura Std Book" w:hAnsi="Futura Std Book"/>
+        </w:rPr>
+      </w:pPr>
+      <w:r>
+        <w:rPr>
+          <w:rFonts w:ascii="Futura Std Book" w:hAnsi="Futura Std Book"/>
         </w:rPr>
         <w:t>The system will automatically detect if the net_pulse database exists.</w:t>
       </w:r>
@@ -724,22 +567,14 @@
         </w:numPr>
         <w:jc w:val="both"/>
         <w:rPr>
-          <w:rFonts w:ascii="Futura" w:hAnsi="Futura"/>
-        </w:rPr>
-      </w:pPr>
-      <w:r>
-        <w:rPr>
-          <w:rFonts w:ascii="Futura" w:hAnsi="Futura"/>
-          <w:b/>
-          <w:bCs/>
-        </w:rPr>
-        <w:t>If not found:</w:t>
-      </w:r>
-      <w:r>
-        <w:rPr>
-          <w:rFonts w:ascii="Futura" w:hAnsi="Futura"/>
-        </w:rPr>
-        <w:t xml:space="preserve"> It will instantly create the database, the users table, and the default admin account.</w:t>
+          <w:rFonts w:ascii="Futura Std Book" w:hAnsi="Futura Std Book"/>
+        </w:rPr>
+      </w:pPr>
+      <w:r>
+        <w:rPr>
+          <w:rFonts w:ascii="Futura Std Book" w:hAnsi="Futura Std Book"/>
+        </w:rPr>
+        <w:t>If not found: It will instantly create the database, the users table, and the default admin account.</w:t>
       </w:r>
     </w:p>
     <w:p>
@@ -750,28 +585,18 @@
         </w:numPr>
         <w:jc w:val="both"/>
         <w:rPr>
-          <w:rFonts w:ascii="Futura" w:hAnsi="Futura"/>
-        </w:rPr>
-      </w:pPr>
-      <w:r>
-        <w:rPr>
-          <w:rFonts w:ascii="Futura" w:hAnsi="Futura"/>
-          <w:b/>
-          <w:bCs/>
-        </w:rPr>
-        <w:t>Configuration:</w:t>
-      </w:r>
-      <w:r>
-        <w:rPr>
-          <w:rFonts w:ascii="Futura" w:hAnsi="Futura"/>
-        </w:rPr>
-        <w:t xml:space="preserve"> If your MySQL root user has a password, update the $pass variable in </w:t>
-      </w:r>
-      <w:r>
-        <w:rPr>
-          <w:rFonts w:ascii="Futura" w:hAnsi="Futura"/>
-          <w:b/>
-          <w:bCs/>
+          <w:rFonts w:ascii="Futura Std Book" w:hAnsi="Futura Std Book"/>
+        </w:rPr>
+      </w:pPr>
+      <w:r>
+        <w:rPr>
+          <w:rFonts w:ascii="Futura Std Book" w:hAnsi="Futura Std Book"/>
+        </w:rPr>
+        <w:t xml:space="preserve">Configuration: If your MySQL root user has a password, update the $pass variable in </w:t>
+      </w:r>
+      <w:r>
+        <w:rPr>
+          <w:rFonts w:ascii="Futura Std Book" w:hAnsi="Futura Std Book"/>
           <w:i/>
           <w:iCs/>
         </w:rPr>
@@ -779,7 +604,7 @@
       </w:r>
       <w:r>
         <w:rPr>
-          <w:rFonts w:ascii="Futura" w:hAnsi="Futura"/>
+          <w:rFonts w:ascii="Futura Std Book" w:hAnsi="Futura Std Book"/>
         </w:rPr>
         <w:t xml:space="preserve"> before the first run.</w:t>
       </w:r>
@@ -788,17 +613,15 @@
       <w:pPr>
         <w:jc w:val="both"/>
         <w:rPr>
-          <w:rFonts w:ascii="Futura" w:hAnsi="Futura"/>
-          <w:b/>
-          <w:bCs/>
-        </w:rPr>
-      </w:pPr>
-      <w:r>
-        <w:rPr>
-          <w:rFonts w:ascii="Futura" w:hAnsi="Futura"/>
+          <w:rFonts w:ascii="Futura Std Book" w:hAnsi="Futura Std Book"/>
+        </w:rPr>
+      </w:pPr>
+      <w:r>
+        <w:rPr>
+          <w:rFonts w:ascii="Futura Std Book" w:hAnsi="Futura Std Book"/>
         </w:rPr>
         <w:pict w14:anchorId="243AA536">
-          <v:rect id="_x0000_i1028" style="width:0;height:1.5pt" o:hralign="center" o:hrstd="t" o:hr="t" fillcolor="#a0a0a0" stroked="f"/>
+          <v:rect id="_x0000_i1099" style="width:0;height:1.5pt" o:hralign="center" o:hrstd="t" o:hr="t" fillcolor="#a0a0a0" stroked="f"/>
         </w:pict>
       </w:r>
     </w:p>
@@ -806,21 +629,108 @@
       <w:pPr>
         <w:jc w:val="both"/>
         <w:rPr>
-          <w:rFonts w:ascii="Futura" w:hAnsi="Futura"/>
-          <w:b/>
-          <w:bCs/>
+          <w:rFonts w:ascii="Futura Std Book" w:hAnsi="Futura Std Book"/>
+        </w:rPr>
+      </w:pPr>
+    </w:p>
+    <w:p>
+      <w:pPr>
+        <w:jc w:val="both"/>
+        <w:rPr>
+          <w:rFonts w:ascii="Futura Std Book" w:hAnsi="Futura Std Book"/>
+        </w:rPr>
+      </w:pPr>
+    </w:p>
+    <w:p>
+      <w:pPr>
+        <w:jc w:val="both"/>
+        <w:rPr>
+          <w:rFonts w:ascii="Futura Std Book" w:hAnsi="Futura Std Book"/>
+        </w:rPr>
+      </w:pPr>
+    </w:p>
+    <w:p>
+      <w:pPr>
+        <w:jc w:val="both"/>
+        <w:rPr>
+          <w:rFonts w:ascii="Futura Std Book" w:hAnsi="Futura Std Book"/>
+        </w:rPr>
+      </w:pPr>
+    </w:p>
+    <w:p>
+      <w:pPr>
+        <w:jc w:val="both"/>
+        <w:rPr>
+          <w:rFonts w:ascii="Futura Std Book" w:hAnsi="Futura Std Book"/>
+        </w:rPr>
+      </w:pPr>
+    </w:p>
+    <w:p>
+      <w:pPr>
+        <w:jc w:val="both"/>
+        <w:rPr>
+          <w:rFonts w:ascii="Futura Std Book" w:hAnsi="Futura Std Book"/>
+        </w:rPr>
+      </w:pPr>
+    </w:p>
+    <w:p>
+      <w:pPr>
+        <w:jc w:val="both"/>
+        <w:rPr>
+          <w:rFonts w:ascii="Futura Std Book" w:hAnsi="Futura Std Book"/>
+        </w:rPr>
+      </w:pPr>
+    </w:p>
+    <w:p>
+      <w:pPr>
+        <w:jc w:val="both"/>
+        <w:rPr>
+          <w:rFonts w:ascii="Futura Std Book" w:hAnsi="Futura Std Book"/>
+        </w:rPr>
+      </w:pPr>
+    </w:p>
+    <w:p>
+      <w:pPr>
+        <w:jc w:val="both"/>
+        <w:rPr>
+          <w:rFonts w:ascii="Futura Std Book" w:hAnsi="Futura Std Book"/>
+        </w:rPr>
+      </w:pPr>
+    </w:p>
+    <w:p>
+      <w:pPr>
+        <w:jc w:val="both"/>
+        <w:rPr>
+          <w:rFonts w:ascii="Futura Std Book" w:hAnsi="Futura Std Book"/>
           <w:sz w:val="32"/>
           <w:szCs w:val="40"/>
         </w:rPr>
       </w:pPr>
       <w:r>
         <w:rPr>
-          <w:rFonts w:ascii="Futura" w:hAnsi="Futura"/>
-          <w:b/>
-          <w:bCs/>
+          <w:rFonts w:ascii="Futura Std Book" w:hAnsi="Futura Std Book"/>
+        </w:rPr>
+        <w:lastRenderedPageBreak/>
+        <w:pict w14:anchorId="28737775">
+          <v:rect id="_x0000_i1100" style="width:0;height:1.5pt" o:hralign="center" o:hrstd="t" o:hr="t" fillcolor="#a0a0a0" stroked="f"/>
+        </w:pict>
+      </w:r>
+    </w:p>
+    <w:p>
+      <w:pPr>
+        <w:jc w:val="both"/>
+        <w:rPr>
+          <w:rFonts w:ascii="Futura Std Book" w:hAnsi="Futura Std Book"/>
           <w:sz w:val="32"/>
           <w:szCs w:val="40"/>
         </w:rPr>
+      </w:pPr>
+      <w:r>
+        <w:rPr>
+          <w:rFonts w:ascii="Futura Std Book" w:hAnsi="Futura Std Book"/>
+          <w:sz w:val="32"/>
+          <w:szCs w:val="40"/>
+        </w:rPr>
         <w:t>Administrative Access</w:t>
       </w:r>
     </w:p>
@@ -828,12 +738,12 @@
       <w:pPr>
         <w:jc w:val="both"/>
         <w:rPr>
-          <w:rFonts w:ascii="Futura" w:hAnsi="Futura"/>
-        </w:rPr>
-      </w:pPr>
-      <w:r>
-        <w:rPr>
-          <w:rFonts w:ascii="Futura" w:hAnsi="Futura"/>
+          <w:rFonts w:ascii="Futura Std Book" w:hAnsi="Futura Std Book"/>
+        </w:rPr>
+      </w:pPr>
+      <w:r>
+        <w:rPr>
+          <w:rFonts w:ascii="Futura Std Book" w:hAnsi="Futura Std Book"/>
         </w:rPr>
         <w:t>Once the auto-initialization is complete, you can log in immediately.</w:t>
       </w:r>
@@ -842,14 +752,14 @@
       <w:pPr>
         <w:jc w:val="center"/>
         <w:rPr>
-          <w:rFonts w:ascii="Futura" w:hAnsi="Futura"/>
-          <w:i/>
-          <w:iCs/>
-        </w:rPr>
-      </w:pPr>
-      <w:r>
-        <w:rPr>
-          <w:rFonts w:ascii="Futura" w:hAnsi="Futura"/>
+          <w:rFonts w:ascii="Futura Std Book" w:hAnsi="Futura Std Book"/>
+          <w:i/>
+          <w:iCs/>
+        </w:rPr>
+      </w:pPr>
+      <w:r>
+        <w:rPr>
+          <w:rFonts w:ascii="Futura Std Book" w:hAnsi="Futura Std Book"/>
           <w:noProof/>
         </w:rPr>
         <w:drawing>
@@ -890,13 +800,13 @@
       </w:r>
       <w:r>
         <w:rPr>
-          <w:rFonts w:ascii="Futura" w:hAnsi="Futura"/>
+          <w:rFonts w:ascii="Futura Std Book" w:hAnsi="Futura Std Book"/>
         </w:rPr>
         <w:br/>
       </w:r>
       <w:r>
         <w:rPr>
-          <w:rFonts w:ascii="Futura" w:hAnsi="Futura"/>
+          <w:rFonts w:ascii="Futura Std Book" w:hAnsi="Futura Std Book"/>
           <w:i/>
           <w:iCs/>
           <w:sz w:val="20"/>
@@ -913,23 +823,14 @@
         </w:numPr>
         <w:jc w:val="both"/>
         <w:rPr>
-          <w:rFonts w:ascii="Futura" w:hAnsi="Futura"/>
-        </w:rPr>
-      </w:pPr>
-      <w:r>
-        <w:rPr>
-          <w:rFonts w:ascii="Futura" w:hAnsi="Futura"/>
-          <w:b/>
-          <w:bCs/>
-        </w:rPr>
-        <w:lastRenderedPageBreak/>
-        <w:t>Default Credentials:</w:t>
-      </w:r>
-      <w:r>
-        <w:rPr>
-          <w:rFonts w:ascii="Futura" w:hAnsi="Futura"/>
-        </w:rPr>
-        <w:t xml:space="preserve"> </w:t>
+          <w:rFonts w:ascii="Futura Std Book" w:hAnsi="Futura Std Book"/>
+        </w:rPr>
+      </w:pPr>
+      <w:r>
+        <w:rPr>
+          <w:rFonts w:ascii="Futura Std Book" w:hAnsi="Futura Std Book"/>
+        </w:rPr>
+        <w:t xml:space="preserve">Default Credentials: </w:t>
       </w:r>
     </w:p>
     <w:p>
@@ -937,28 +838,14 @@
         <w:ind w:left="720"/>
         <w:jc w:val="both"/>
         <w:rPr>
-          <w:rFonts w:ascii="Futura" w:hAnsi="Futura"/>
-        </w:rPr>
-      </w:pPr>
-      <w:r>
-        <w:rPr>
-          <w:rFonts w:ascii="Futura" w:hAnsi="Futura"/>
-        </w:rPr>
-        <w:t xml:space="preserve">* </w:t>
-      </w:r>
-      <w:r>
-        <w:rPr>
-          <w:rFonts w:ascii="Futura" w:hAnsi="Futura"/>
-          <w:b/>
-          <w:bCs/>
-        </w:rPr>
-        <w:t>Username:</w:t>
-      </w:r>
-      <w:r>
-        <w:rPr>
-          <w:rFonts w:ascii="Futura" w:hAnsi="Futura"/>
-        </w:rPr>
-        <w:t xml:space="preserve"> admin</w:t>
+          <w:rFonts w:ascii="Futura Std Book" w:hAnsi="Futura Std Book"/>
+        </w:rPr>
+      </w:pPr>
+      <w:r>
+        <w:rPr>
+          <w:rFonts w:ascii="Futura Std Book" w:hAnsi="Futura Std Book"/>
+        </w:rPr>
+        <w:t>* Username: admin</w:t>
       </w:r>
     </w:p>
     <w:p>
@@ -966,30 +853,14 @@
         <w:ind w:firstLine="720"/>
         <w:jc w:val="both"/>
         <w:rPr>
-          <w:rFonts w:ascii="Futura" w:hAnsi="Futura"/>
-        </w:rPr>
-      </w:pPr>
-      <w:r>
-        <w:rPr>
-          <w:rFonts w:ascii="Futura" w:hAnsi="Futura"/>
-          <w:b/>
-          <w:bCs/>
-        </w:rPr>
-        <w:t xml:space="preserve">* </w:t>
-      </w:r>
-      <w:r>
-        <w:rPr>
-          <w:rFonts w:ascii="Futura" w:hAnsi="Futura"/>
-          <w:b/>
-          <w:bCs/>
-        </w:rPr>
-        <w:t>Password:</w:t>
-      </w:r>
-      <w:r>
-        <w:rPr>
-          <w:rFonts w:ascii="Futura" w:hAnsi="Futura"/>
-        </w:rPr>
-        <w:t xml:space="preserve"> adminpassword</w:t>
+          <w:rFonts w:ascii="Futura Std Book" w:hAnsi="Futura Std Book"/>
+        </w:rPr>
+      </w:pPr>
+      <w:r>
+        <w:rPr>
+          <w:rFonts w:ascii="Futura Std Book" w:hAnsi="Futura Std Book"/>
+        </w:rPr>
+        <w:t>* Password: adminpassword</w:t>
       </w:r>
     </w:p>
     <w:p>
@@ -997,20 +868,20 @@
         <w:ind w:firstLine="720"/>
         <w:jc w:val="both"/>
         <w:rPr>
-          <w:rFonts w:ascii="Futura" w:hAnsi="Futura"/>
-        </w:rPr>
-      </w:pPr>
-    </w:p>
-    <w:p>
-      <w:pPr>
-        <w:jc w:val="both"/>
-        <w:rPr>
-          <w:rFonts w:ascii="Futura" w:hAnsi="Futura"/>
-        </w:rPr>
-      </w:pPr>
-      <w:r>
-        <w:rPr>
-          <w:rFonts w:ascii="Futura" w:hAnsi="Futura"/>
+          <w:rFonts w:ascii="Futura Std Book" w:hAnsi="Futura Std Book"/>
+        </w:rPr>
+      </w:pPr>
+    </w:p>
+    <w:p>
+      <w:pPr>
+        <w:jc w:val="both"/>
+        <w:rPr>
+          <w:rFonts w:ascii="Futura Std Book" w:hAnsi="Futura Std Book"/>
+        </w:rPr>
+      </w:pPr>
+      <w:r>
+        <w:rPr>
+          <w:rFonts w:ascii="Futura Std Book" w:hAnsi="Futura Std Book"/>
           <w:i/>
           <w:iCs/>
         </w:rPr>
@@ -1022,7 +893,7 @@
         <w:ind w:firstLine="720"/>
         <w:jc w:val="both"/>
         <w:rPr>
-          <w:rFonts w:ascii="Futura" w:hAnsi="Futura"/>
+          <w:rFonts w:ascii="Futura Std Book" w:hAnsi="Futura Std Book"/>
           <w:sz w:val="16"/>
           <w:szCs w:val="16"/>
         </w:rPr>
@@ -1032,16 +903,12 @@
       <w:pPr>
         <w:jc w:val="both"/>
         <w:rPr>
-          <w:rFonts w:ascii="Futura" w:hAnsi="Futura"/>
-          <w:b/>
-          <w:bCs/>
-        </w:rPr>
-      </w:pPr>
-      <w:r>
-        <w:rPr>
-          <w:rFonts w:ascii="Futura" w:hAnsi="Futura"/>
-          <w:b/>
-          <w:bCs/>
+          <w:rFonts w:ascii="Futura Std Book" w:hAnsi="Futura Std Book"/>
+        </w:rPr>
+      </w:pPr>
+      <w:r>
+        <w:rPr>
+          <w:rFonts w:ascii="Futura Std Book" w:hAnsi="Futura Std Book"/>
         </w:rPr>
         <w:t>Adding Additional Admins:</w:t>
       </w:r>
@@ -1050,12 +917,12 @@
       <w:pPr>
         <w:jc w:val="both"/>
         <w:rPr>
-          <w:rFonts w:ascii="Futura" w:hAnsi="Futura"/>
-        </w:rPr>
-      </w:pPr>
-      <w:r>
-        <w:rPr>
-          <w:rFonts w:ascii="Futura" w:hAnsi="Futura"/>
+          <w:rFonts w:ascii="Futura Std Book" w:hAnsi="Futura Std Book"/>
+        </w:rPr>
+      </w:pPr>
+      <w:r>
+        <w:rPr>
+          <w:rFonts w:ascii="Futura Std Book" w:hAnsi="Futura Std Book"/>
         </w:rPr>
         <w:t>To maintain security, the system does not have a public registration page. To add more IT staff:</w:t>
       </w:r>
@@ -1068,28 +935,14 @@
         </w:numPr>
         <w:jc w:val="both"/>
         <w:rPr>
-          <w:rFonts w:ascii="Futura" w:hAnsi="Futura"/>
-        </w:rPr>
-      </w:pPr>
-      <w:r>
-        <w:rPr>
-          <w:rFonts w:ascii="Futura" w:hAnsi="Futura"/>
-        </w:rPr>
-        <w:t xml:space="preserve">Open </w:t>
-      </w:r>
-      <w:r>
-        <w:rPr>
-          <w:rFonts w:ascii="Futura" w:hAnsi="Futura"/>
-          <w:b/>
-          <w:bCs/>
-        </w:rPr>
-        <w:t>phpMyAdmin</w:t>
-      </w:r>
-      <w:r>
-        <w:rPr>
-          <w:rFonts w:ascii="Futura" w:hAnsi="Futura"/>
-        </w:rPr>
-        <w:t>.</w:t>
+          <w:rFonts w:ascii="Futura Std Book" w:hAnsi="Futura Std Book"/>
+        </w:rPr>
+      </w:pPr>
+      <w:r>
+        <w:rPr>
+          <w:rFonts w:ascii="Futura Std Book" w:hAnsi="Futura Std Book"/>
+        </w:rPr>
+        <w:t>Open phpMyAdmin.</w:t>
       </w:r>
     </w:p>
     <w:p>
@@ -1100,12 +953,12 @@
         </w:numPr>
         <w:jc w:val="both"/>
         <w:rPr>
-          <w:rFonts w:ascii="Futura" w:hAnsi="Futura"/>
-        </w:rPr>
-      </w:pPr>
-      <w:r>
-        <w:rPr>
-          <w:rFonts w:ascii="Futura" w:hAnsi="Futura"/>
+          <w:rFonts w:ascii="Futura Std Book" w:hAnsi="Futura Std Book"/>
+        </w:rPr>
+      </w:pPr>
+      <w:r>
+        <w:rPr>
+          <w:rFonts w:ascii="Futura Std Book" w:hAnsi="Futura Std Book"/>
           <w:noProof/>
         </w:rPr>
         <mc:AlternateContent>
@@ -1223,7 +1076,7 @@
       </w:r>
       <w:r>
         <w:rPr>
-          <w:rFonts w:ascii="Futura" w:hAnsi="Futura"/>
+          <w:rFonts w:ascii="Futura Std Book" w:hAnsi="Futura Std Book"/>
         </w:rPr>
         <w:t>Go to the users table in the net_pulse database.</w:t>
       </w:r>
@@ -1232,12 +1085,12 @@
       <w:pPr>
         <w:jc w:val="both"/>
         <w:rPr>
-          <w:rFonts w:ascii="Futura" w:hAnsi="Futura"/>
-        </w:rPr>
-      </w:pPr>
-      <w:r>
-        <w:rPr>
-          <w:rFonts w:ascii="Futura" w:hAnsi="Futura"/>
+          <w:rFonts w:ascii="Futura Std Book" w:hAnsi="Futura Std Book"/>
+        </w:rPr>
+      </w:pPr>
+      <w:r>
+        <w:rPr>
+          <w:rFonts w:ascii="Futura Std Book" w:hAnsi="Futura Std Book"/>
           <w:noProof/>
         </w:rPr>
         <mc:AlternateContent>
@@ -1311,7 +1164,7 @@
       </w:r>
       <w:r>
         <w:rPr>
-          <w:rFonts w:ascii="Futura" w:hAnsi="Futura"/>
+          <w:rFonts w:ascii="Futura Std Book" w:hAnsi="Futura Std Book"/>
           <w:noProof/>
         </w:rPr>
         <w:drawing>
@@ -1355,12 +1208,12 @@
       <w:pPr>
         <w:jc w:val="both"/>
         <w:rPr>
-          <w:rFonts w:ascii="Futura" w:hAnsi="Futura"/>
-        </w:rPr>
-      </w:pPr>
-      <w:r>
-        <w:rPr>
-          <w:rFonts w:ascii="Futura" w:hAnsi="Futura"/>
+          <w:rFonts w:ascii="Futura Std Book" w:hAnsi="Futura Std Book"/>
+        </w:rPr>
+      </w:pPr>
+      <w:r>
+        <w:rPr>
+          <w:rFonts w:ascii="Futura Std Book" w:hAnsi="Futura Std Book"/>
           <w:noProof/>
         </w:rPr>
         <mc:AlternateContent>
@@ -1474,7 +1327,7 @@
       </w:r>
       <w:r>
         <w:rPr>
-          <w:rFonts w:ascii="Futura" w:hAnsi="Futura"/>
+          <w:rFonts w:ascii="Futura Std Book" w:hAnsi="Futura Std Book"/>
           <w:noProof/>
         </w:rPr>
         <mc:AlternateContent>
@@ -1550,7 +1403,7 @@
       </w:r>
       <w:r>
         <w:rPr>
-          <w:rFonts w:ascii="Futura" w:hAnsi="Futura"/>
+          <w:rFonts w:ascii="Futura Std Book" w:hAnsi="Futura Std Book"/>
           <w:noProof/>
         </w:rPr>
         <w:drawing>
@@ -1594,12 +1447,12 @@
       <w:pPr>
         <w:jc w:val="both"/>
         <w:rPr>
-          <w:rFonts w:ascii="Futura" w:hAnsi="Futura"/>
-        </w:rPr>
-      </w:pPr>
-      <w:r>
-        <w:rPr>
-          <w:rFonts w:ascii="Futura" w:hAnsi="Futura"/>
+          <w:rFonts w:ascii="Futura Std Book" w:hAnsi="Futura Std Book"/>
+        </w:rPr>
+      </w:pPr>
+      <w:r>
+        <w:rPr>
+          <w:rFonts w:ascii="Futura Std Book" w:hAnsi="Futura Std Book"/>
           <w:noProof/>
         </w:rPr>
         <mc:AlternateContent>
@@ -1675,28 +1528,14 @@
         </w:numPr>
         <w:jc w:val="both"/>
         <w:rPr>
-          <w:rFonts w:ascii="Futura" w:hAnsi="Futura"/>
-        </w:rPr>
-      </w:pPr>
-      <w:r>
-        <w:rPr>
-          <w:rFonts w:ascii="Futura" w:hAnsi="Futura"/>
-        </w:rPr>
-        <w:t xml:space="preserve">Click on the </w:t>
-      </w:r>
-      <w:r>
-        <w:rPr>
-          <w:rFonts w:ascii="Futura" w:hAnsi="Futura"/>
-          <w:b/>
-          <w:bCs/>
-        </w:rPr>
-        <w:t>Insert</w:t>
-      </w:r>
-      <w:r>
-        <w:rPr>
-          <w:rFonts w:ascii="Futura" w:hAnsi="Futura"/>
-        </w:rPr>
-        <w:t xml:space="preserve"> tab.</w:t>
+          <w:rFonts w:ascii="Futura Std Book" w:hAnsi="Futura Std Book"/>
+        </w:rPr>
+      </w:pPr>
+      <w:r>
+        <w:rPr>
+          <w:rFonts w:ascii="Futura Std Book" w:hAnsi="Futura Std Book"/>
+        </w:rPr>
+        <w:t>Click on the Insert tab.</w:t>
       </w:r>
     </w:p>
     <w:p>
@@ -1707,13 +1546,14 @@
         </w:numPr>
         <w:jc w:val="both"/>
         <w:rPr>
-          <w:rFonts w:ascii="Futura" w:hAnsi="Futura"/>
-        </w:rPr>
-      </w:pPr>
-      <w:r>
-        <w:rPr>
-          <w:rFonts w:ascii="Futura" w:hAnsi="Futura"/>
-        </w:rPr>
+          <w:rFonts w:ascii="Futura Std Book" w:hAnsi="Futura Std Book"/>
+        </w:rPr>
+      </w:pPr>
+      <w:r>
+        <w:rPr>
+          <w:rFonts w:ascii="Futura Std Book" w:hAnsi="Futura Std Book"/>
+        </w:rPr>
+        <w:lastRenderedPageBreak/>
         <w:t>Fill in values for username and password (only insert a php hashed version of the password otherwise log in will fail).</w:t>
       </w:r>
     </w:p>
@@ -1725,12 +1565,12 @@
         </w:numPr>
         <w:jc w:val="both"/>
         <w:rPr>
-          <w:rFonts w:ascii="Futura" w:hAnsi="Futura"/>
-        </w:rPr>
-      </w:pPr>
-      <w:r>
-        <w:rPr>
-          <w:rFonts w:ascii="Futura" w:hAnsi="Futura"/>
+          <w:rFonts w:ascii="Futura Std Book" w:hAnsi="Futura Std Book"/>
+        </w:rPr>
+      </w:pPr>
+      <w:r>
+        <w:rPr>
+          <w:rFonts w:ascii="Futura Std Book" w:hAnsi="Futura Std Book"/>
         </w:rPr>
         <w:t>Leave the user_id and ping blank.</w:t>
       </w:r>
@@ -1743,12 +1583,12 @@
         </w:numPr>
         <w:jc w:val="both"/>
         <w:rPr>
-          <w:rFonts w:ascii="Futura" w:hAnsi="Futura"/>
-        </w:rPr>
-      </w:pPr>
-      <w:r>
-        <w:rPr>
-          <w:rFonts w:ascii="Futura" w:hAnsi="Futura"/>
+          <w:rFonts w:ascii="Futura Std Book" w:hAnsi="Futura Std Book"/>
+        </w:rPr>
+      </w:pPr>
+      <w:r>
+        <w:rPr>
+          <w:rFonts w:ascii="Futura Std Book" w:hAnsi="Futura Std Book"/>
         </w:rPr>
         <w:t>Click Go. A new account has been registered and can be used for login.</w:t>
       </w:r>
@@ -1757,15 +1597,15 @@
       <w:pPr>
         <w:jc w:val="both"/>
         <w:rPr>
-          <w:rFonts w:ascii="Futura" w:hAnsi="Futura"/>
-        </w:rPr>
-      </w:pPr>
-      <w:r>
-        <w:rPr>
-          <w:rFonts w:ascii="Futura" w:hAnsi="Futura"/>
+          <w:rFonts w:ascii="Futura Std Book" w:hAnsi="Futura Std Book"/>
+        </w:rPr>
+      </w:pPr>
+      <w:r>
+        <w:rPr>
+          <w:rFonts w:ascii="Futura Std Book" w:hAnsi="Futura Std Book"/>
         </w:rPr>
         <w:pict w14:anchorId="78E0DC9C">
-          <v:rect id="_x0000_i1029" style="width:0;height:1.5pt" o:hralign="center" o:hrstd="t" o:hr="t" fillcolor="#a0a0a0" stroked="f"/>
+          <v:rect id="_x0000_i1101" style="width:0;height:1.5pt" o:hralign="center" o:hrstd="t" o:hr="t" fillcolor="#a0a0a0" stroked="f"/>
         </w:pict>
       </w:r>
     </w:p>
@@ -1773,157 +1613,12 @@
       <w:pPr>
         <w:jc w:val="both"/>
         <w:rPr>
-          <w:rFonts w:ascii="Futura" w:hAnsi="Futura"/>
-          <w:b/>
-          <w:bCs/>
-          <w:sz w:val="32"/>
-          <w:szCs w:val="40"/>
-        </w:rPr>
-      </w:pPr>
-    </w:p>
-    <w:p>
-      <w:pPr>
-        <w:jc w:val="both"/>
-        <w:rPr>
-          <w:rFonts w:ascii="Futura" w:hAnsi="Futura"/>
-          <w:b/>
-          <w:bCs/>
-          <w:sz w:val="32"/>
-          <w:szCs w:val="40"/>
-        </w:rPr>
-      </w:pPr>
-    </w:p>
-    <w:p>
-      <w:pPr>
-        <w:jc w:val="both"/>
-        <w:rPr>
-          <w:rFonts w:ascii="Futura" w:hAnsi="Futura"/>
-          <w:b/>
-          <w:bCs/>
-          <w:sz w:val="32"/>
-          <w:szCs w:val="40"/>
-        </w:rPr>
-      </w:pPr>
-    </w:p>
-    <w:p>
-      <w:pPr>
-        <w:jc w:val="both"/>
-        <w:rPr>
-          <w:rFonts w:ascii="Futura" w:hAnsi="Futura"/>
-          <w:b/>
-          <w:bCs/>
-          <w:sz w:val="32"/>
-          <w:szCs w:val="40"/>
-        </w:rPr>
-      </w:pPr>
-    </w:p>
-    <w:p>
-      <w:pPr>
-        <w:jc w:val="both"/>
-        <w:rPr>
-          <w:rFonts w:ascii="Futura" w:hAnsi="Futura"/>
-          <w:b/>
-          <w:bCs/>
-          <w:sz w:val="32"/>
-          <w:szCs w:val="40"/>
-        </w:rPr>
-      </w:pPr>
-    </w:p>
-    <w:p>
-      <w:pPr>
-        <w:jc w:val="both"/>
-        <w:rPr>
-          <w:rFonts w:ascii="Futura" w:hAnsi="Futura"/>
-          <w:b/>
-          <w:bCs/>
-          <w:sz w:val="32"/>
-          <w:szCs w:val="40"/>
-        </w:rPr>
-      </w:pPr>
-    </w:p>
-    <w:p>
-      <w:pPr>
-        <w:jc w:val="both"/>
-        <w:rPr>
-          <w:rFonts w:ascii="Futura" w:hAnsi="Futura"/>
-          <w:b/>
-          <w:bCs/>
-          <w:sz w:val="32"/>
-          <w:szCs w:val="40"/>
-        </w:rPr>
-      </w:pPr>
-    </w:p>
-    <w:p>
-      <w:pPr>
-        <w:jc w:val="both"/>
-        <w:rPr>
-          <w:rFonts w:ascii="Futura" w:hAnsi="Futura"/>
-          <w:b/>
-          <w:bCs/>
-          <w:sz w:val="32"/>
-          <w:szCs w:val="40"/>
-        </w:rPr>
-      </w:pPr>
-    </w:p>
-    <w:p>
-      <w:pPr>
-        <w:jc w:val="both"/>
-        <w:rPr>
-          <w:rFonts w:ascii="Futura" w:hAnsi="Futura"/>
-          <w:b/>
-          <w:bCs/>
-          <w:sz w:val="32"/>
-          <w:szCs w:val="40"/>
-        </w:rPr>
-      </w:pPr>
-    </w:p>
-    <w:p>
-      <w:pPr>
-        <w:jc w:val="both"/>
-        <w:rPr>
-          <w:rFonts w:ascii="Futura" w:hAnsi="Futura"/>
-          <w:b/>
-          <w:bCs/>
-          <w:sz w:val="32"/>
-          <w:szCs w:val="40"/>
-        </w:rPr>
-      </w:pPr>
-    </w:p>
-    <w:p>
-      <w:pPr>
-        <w:jc w:val="both"/>
-        <w:rPr>
-          <w:rFonts w:ascii="Futura" w:hAnsi="Futura"/>
-          <w:b/>
-          <w:bCs/>
-          <w:sz w:val="32"/>
-          <w:szCs w:val="40"/>
-        </w:rPr>
-      </w:pPr>
-      <w:r>
-        <w:rPr>
-          <w:rFonts w:ascii="Futura" w:hAnsi="Futura"/>
-        </w:rPr>
-        <w:lastRenderedPageBreak/>
-        <w:pict w14:anchorId="762D926A">
-          <v:rect id="_x0000_i1040" style="width:0;height:1.5pt" o:hralign="center" o:hrstd="t" o:hr="t" fillcolor="#a0a0a0" stroked="f"/>
-        </w:pict>
-      </w:r>
-    </w:p>
-    <w:p>
-      <w:pPr>
-        <w:jc w:val="both"/>
-        <w:rPr>
-          <w:rFonts w:ascii="Futura" w:hAnsi="Futura"/>
-          <w:b/>
-          <w:bCs/>
-        </w:rPr>
-      </w:pPr>
-      <w:r>
-        <w:rPr>
-          <w:rFonts w:ascii="Futura" w:hAnsi="Futura"/>
-          <w:b/>
-          <w:bCs/>
+          <w:rFonts w:ascii="Futura Std Book" w:hAnsi="Futura Std Book"/>
+        </w:rPr>
+      </w:pPr>
+      <w:r>
+        <w:rPr>
+          <w:rFonts w:ascii="Futura Std Book" w:hAnsi="Futura Std Book"/>
           <w:sz w:val="32"/>
           <w:szCs w:val="40"/>
         </w:rPr>
@@ -1938,29 +1633,21 @@
         </w:numPr>
         <w:jc w:val="both"/>
         <w:rPr>
-          <w:rFonts w:ascii="Futura" w:hAnsi="Futura"/>
-        </w:rPr>
-      </w:pPr>
-      <w:r>
-        <w:rPr>
-          <w:rFonts w:ascii="Futura" w:hAnsi="Futura"/>
-          <w:b/>
-          <w:bCs/>
-        </w:rPr>
-        <w:t>The Dashboard:</w:t>
-      </w:r>
-      <w:r>
-        <w:rPr>
-          <w:rFonts w:ascii="Futura" w:hAnsi="Futura"/>
-        </w:rPr>
-        <w:t xml:space="preserve"> Provides a live "Pulse" of the network. The system uses latencyTracker.js to feed data into a Chart.js interface.</w:t>
+          <w:rFonts w:ascii="Futura Std Book" w:hAnsi="Futura Std Book"/>
+        </w:rPr>
+      </w:pPr>
+      <w:r>
+        <w:rPr>
+          <w:rFonts w:ascii="Futura Std Book" w:hAnsi="Futura Std Book"/>
+        </w:rPr>
+        <w:t>The Dashboard: Provides a live "Pulse" of the network. The system uses latencyTracker.js to feed data into a Chart.js interface.</w:t>
       </w:r>
     </w:p>
     <w:p>
       <w:pPr>
         <w:jc w:val="center"/>
         <w:rPr>
-          <w:rFonts w:ascii="Futura" w:hAnsi="Futura"/>
+          <w:rFonts w:ascii="Futura Std Book" w:hAnsi="Futura Std Book"/>
           <w:i/>
           <w:iCs/>
           <w:sz w:val="20"/>
@@ -1969,11 +1656,11 @@
       </w:pPr>
       <w:r>
         <w:rPr>
-          <w:rFonts w:ascii="Futura" w:hAnsi="Futura"/>
+          <w:rFonts w:ascii="Futura Std Book" w:hAnsi="Futura Std Book"/>
           <w:noProof/>
         </w:rPr>
         <w:drawing>
-          <wp:inline distT="0" distB="0" distL="0" distR="0" wp14:anchorId="52B0E5AA" wp14:editId="18682F06">
+          <wp:inline distT="0" distB="0" distL="0" distR="0" wp14:anchorId="52B0E5AA" wp14:editId="6D67E33B">
             <wp:extent cx="5193419" cy="2919633"/>
             <wp:effectExtent l="0" t="0" r="7620" b="0"/>
             <wp:docPr id="2132783825" name="Picture 1"/>
@@ -2016,13 +1703,13 @@
       </w:r>
       <w:r>
         <w:rPr>
-          <w:rFonts w:ascii="Futura" w:hAnsi="Futura"/>
+          <w:rFonts w:ascii="Futura Std Book" w:hAnsi="Futura Std Book"/>
         </w:rPr>
         <w:br/>
       </w:r>
       <w:r>
         <w:rPr>
-          <w:rFonts w:ascii="Futura" w:hAnsi="Futura"/>
+          <w:rFonts w:ascii="Futura Std Book" w:hAnsi="Futura Std Book"/>
           <w:i/>
           <w:iCs/>
           <w:sz w:val="20"/>
@@ -2035,19 +1722,7 @@
       <w:pPr>
         <w:jc w:val="center"/>
         <w:rPr>
-          <w:rFonts w:ascii="Futura" w:hAnsi="Futura"/>
-          <w:i/>
-          <w:iCs/>
-          <w:sz w:val="20"/>
-          <w:szCs w:val="20"/>
-        </w:rPr>
-      </w:pPr>
-    </w:p>
-    <w:p>
-      <w:pPr>
-        <w:jc w:val="center"/>
-        <w:rPr>
-          <w:rFonts w:ascii="Futura" w:hAnsi="Futura"/>
+          <w:rFonts w:ascii="Futura Std Book" w:hAnsi="Futura Std Book"/>
           <w:i/>
           <w:iCs/>
           <w:sz w:val="20"/>
@@ -2063,28 +1738,20 @@
           <w:numId w:val="7"/>
         </w:numPr>
         <w:rPr>
-          <w:rFonts w:ascii="Futura" w:hAnsi="Futura"/>
+          <w:rFonts w:ascii="Futura Std Book" w:hAnsi="Futura Std Book"/>
           <w:sz w:val="20"/>
           <w:szCs w:val="20"/>
         </w:rPr>
       </w:pPr>
       <w:r>
         <w:rPr>
-          <w:rFonts w:ascii="Futura" w:hAnsi="Futura"/>
-          <w:b/>
-          <w:bCs/>
-        </w:rPr>
-        <w:t>Network Monitoring Pages:</w:t>
-      </w:r>
-      <w:r>
-        <w:rPr>
-          <w:rFonts w:ascii="Futura" w:hAnsi="Futura"/>
-        </w:rPr>
-        <w:t xml:space="preserve"> </w:t>
-      </w:r>
-      <w:r>
-        <w:rPr>
-          <w:rFonts w:ascii="Futura" w:hAnsi="Futura"/>
+          <w:rFonts w:ascii="Futura Std Book" w:hAnsi="Futura Std Book"/>
+        </w:rPr>
+        <w:t xml:space="preserve">Network Monitoring Pages: </w:t>
+      </w:r>
+      <w:r>
+        <w:rPr>
+          <w:rFonts w:ascii="Futura Std Book" w:hAnsi="Futura Std Book"/>
         </w:rPr>
         <w:t>Illustrates network health of the corresponding devices or addresses of that web page:</w:t>
       </w:r>
@@ -2093,7 +1760,7 @@
       <w:pPr>
         <w:jc w:val="center"/>
         <w:rPr>
-          <w:rFonts w:ascii="Futura" w:hAnsi="Futura"/>
+          <w:rFonts w:ascii="Futura Std Book" w:hAnsi="Futura Std Book"/>
           <w:i/>
           <w:iCs/>
           <w:sz w:val="20"/>
@@ -2102,7 +1769,7 @@
       </w:pPr>
       <w:r>
         <w:rPr>
-          <w:rFonts w:ascii="Futura" w:hAnsi="Futura"/>
+          <w:rFonts w:ascii="Futura Std Book" w:hAnsi="Futura Std Book"/>
           <w:noProof/>
           <w:sz w:val="20"/>
           <w:szCs w:val="20"/>
@@ -2145,7 +1812,7 @@
       </w:r>
       <w:r>
         <w:rPr>
-          <w:rFonts w:ascii="Futura" w:hAnsi="Futura"/>
+          <w:rFonts w:ascii="Futura Std Book" w:hAnsi="Futura Std Book"/>
           <w:i/>
           <w:iCs/>
           <w:sz w:val="20"/>
@@ -2158,7 +1825,7 @@
       <w:pPr>
         <w:jc w:val="center"/>
         <w:rPr>
-          <w:rFonts w:ascii="Futura" w:hAnsi="Futura"/>
+          <w:rFonts w:ascii="Futura Std Book" w:hAnsi="Futura Std Book"/>
           <w:i/>
           <w:iCs/>
           <w:sz w:val="20"/>
@@ -2170,7 +1837,7 @@
       <w:pPr>
         <w:jc w:val="center"/>
         <w:rPr>
-          <w:rFonts w:ascii="Futura" w:hAnsi="Futura"/>
+          <w:rFonts w:ascii="Futura Std Book" w:hAnsi="Futura Std Book"/>
           <w:i/>
           <w:iCs/>
           <w:sz w:val="20"/>
@@ -2179,7 +1846,7 @@
       </w:pPr>
       <w:r>
         <w:rPr>
-          <w:rFonts w:ascii="Futura" w:hAnsi="Futura"/>
+          <w:rFonts w:ascii="Futura Std Book" w:hAnsi="Futura Std Book"/>
           <w:i/>
           <w:iCs/>
           <w:sz w:val="20"/>
@@ -2189,7 +1856,7 @@
       </w:r>
       <w:r>
         <w:rPr>
-          <w:rFonts w:ascii="Futura" w:hAnsi="Futura"/>
+          <w:rFonts w:ascii="Futura Std Book" w:hAnsi="Futura Std Book"/>
           <w:i/>
           <w:iCs/>
           <w:sz w:val="20"/>
@@ -2199,14 +1866,13 @@
       </w:r>
       <w:r>
         <w:rPr>
-          <w:rFonts w:ascii="Futura" w:hAnsi="Futura"/>
+          <w:rFonts w:ascii="Futura Std Book" w:hAnsi="Futura Std Book"/>
           <w:i/>
           <w:iCs/>
           <w:noProof/>
           <w:sz w:val="20"/>
           <w:szCs w:val="20"/>
         </w:rPr>
-        <w:lastRenderedPageBreak/>
         <w:drawing>
           <wp:inline distT="0" distB="0" distL="0" distR="0" wp14:anchorId="49C41F66" wp14:editId="2BE4DEDE">
             <wp:extent cx="5943600" cy="3341370"/>
@@ -2245,7 +1911,7 @@
       </w:r>
       <w:r>
         <w:rPr>
-          <w:rFonts w:ascii="Futura" w:hAnsi="Futura"/>
+          <w:rFonts w:ascii="Futura Std Book" w:hAnsi="Futura Std Book"/>
           <w:i/>
           <w:iCs/>
           <w:sz w:val="20"/>
@@ -2259,7 +1925,7 @@
       <w:pPr>
         <w:jc w:val="center"/>
         <w:rPr>
-          <w:rFonts w:ascii="Futura" w:hAnsi="Futura"/>
+          <w:rFonts w:ascii="Futura Std Book" w:hAnsi="Futura Std Book"/>
           <w:i/>
           <w:iCs/>
           <w:sz w:val="20"/>
@@ -2271,7 +1937,7 @@
       <w:pPr>
         <w:jc w:val="center"/>
         <w:rPr>
-          <w:rFonts w:ascii="Futura" w:hAnsi="Futura"/>
+          <w:rFonts w:ascii="Futura Std Book" w:hAnsi="Futura Std Book"/>
           <w:i/>
           <w:iCs/>
           <w:sz w:val="20"/>
@@ -2283,7 +1949,7 @@
       <w:pPr>
         <w:jc w:val="center"/>
         <w:rPr>
-          <w:rFonts w:ascii="Futura" w:hAnsi="Futura"/>
+          <w:rFonts w:ascii="Futura Std Book" w:hAnsi="Futura Std Book"/>
           <w:i/>
           <w:iCs/>
           <w:sz w:val="20"/>
@@ -2295,7 +1961,7 @@
       <w:pPr>
         <w:jc w:val="center"/>
         <w:rPr>
-          <w:rFonts w:ascii="Futura" w:hAnsi="Futura"/>
+          <w:rFonts w:ascii="Futura Std Book" w:hAnsi="Futura Std Book"/>
           <w:i/>
           <w:iCs/>
           <w:sz w:val="20"/>
@@ -2307,7 +1973,7 @@
       <w:pPr>
         <w:jc w:val="center"/>
         <w:rPr>
-          <w:rFonts w:ascii="Futura" w:hAnsi="Futura"/>
+          <w:rFonts w:ascii="Futura Std Book" w:hAnsi="Futura Std Book"/>
           <w:i/>
           <w:iCs/>
           <w:sz w:val="20"/>
@@ -2316,7 +1982,7 @@
       </w:pPr>
       <w:r>
         <w:rPr>
-          <w:rFonts w:ascii="Futura" w:hAnsi="Futura"/>
+          <w:rFonts w:ascii="Futura Std Book" w:hAnsi="Futura Std Book"/>
           <w:i/>
           <w:iCs/>
           <w:noProof/>
@@ -2361,7 +2027,7 @@
       </w:r>
       <w:r>
         <w:rPr>
-          <w:rFonts w:ascii="Futura" w:hAnsi="Futura"/>
+          <w:rFonts w:ascii="Futura Std Book" w:hAnsi="Futura Std Book"/>
           <w:i/>
           <w:iCs/>
           <w:sz w:val="20"/>
@@ -2375,7 +2041,7 @@
       <w:pPr>
         <w:jc w:val="center"/>
         <w:rPr>
-          <w:rFonts w:ascii="Futura" w:hAnsi="Futura"/>
+          <w:rFonts w:ascii="Futura Std Book" w:hAnsi="Futura Std Book"/>
           <w:i/>
           <w:iCs/>
           <w:sz w:val="20"/>
@@ -2387,7 +2053,7 @@
       <w:pPr>
         <w:jc w:val="center"/>
         <w:rPr>
-          <w:rFonts w:ascii="Futura" w:hAnsi="Futura"/>
+          <w:rFonts w:ascii="Futura Std Book" w:hAnsi="Futura Std Book"/>
           <w:i/>
           <w:iCs/>
           <w:sz w:val="20"/>
@@ -2399,7 +2065,7 @@
       <w:pPr>
         <w:jc w:val="center"/>
         <w:rPr>
-          <w:rFonts w:ascii="Futura" w:hAnsi="Futura"/>
+          <w:rFonts w:ascii="Futura Std Book" w:hAnsi="Futura Std Book"/>
           <w:i/>
           <w:iCs/>
           <w:sz w:val="20"/>
@@ -2411,7 +2077,7 @@
       <w:pPr>
         <w:jc w:val="center"/>
         <w:rPr>
-          <w:rFonts w:ascii="Futura" w:hAnsi="Futura"/>
+          <w:rFonts w:ascii="Futura Std Book" w:hAnsi="Futura Std Book"/>
           <w:i/>
           <w:iCs/>
           <w:sz w:val="20"/>
@@ -2420,7 +2086,7 @@
       </w:pPr>
       <w:r>
         <w:rPr>
-          <w:rFonts w:ascii="Futura" w:hAnsi="Futura"/>
+          <w:rFonts w:ascii="Futura Std Book" w:hAnsi="Futura Std Book"/>
           <w:i/>
           <w:iCs/>
           <w:noProof/>
@@ -2466,7 +2132,7 @@
       </w:r>
       <w:r>
         <w:rPr>
-          <w:rFonts w:ascii="Futura" w:hAnsi="Futura"/>
+          <w:rFonts w:ascii="Futura Std Book" w:hAnsi="Futura Std Book"/>
           <w:i/>
           <w:iCs/>
           <w:sz w:val="20"/>
@@ -2480,7 +2146,7 @@
       <w:pPr>
         <w:jc w:val="center"/>
         <w:rPr>
-          <w:rFonts w:ascii="Futura" w:hAnsi="Futura"/>
+          <w:rFonts w:ascii="Futura Std Book" w:hAnsi="Futura Std Book"/>
           <w:i/>
           <w:iCs/>
           <w:sz w:val="20"/>
@@ -2492,7 +2158,7 @@
       <w:pPr>
         <w:jc w:val="center"/>
         <w:rPr>
-          <w:rFonts w:ascii="Futura" w:hAnsi="Futura"/>
+          <w:rFonts w:ascii="Futura Std Book" w:hAnsi="Futura Std Book"/>
           <w:i/>
           <w:iCs/>
           <w:sz w:val="20"/>
@@ -2504,7 +2170,7 @@
       <w:pPr>
         <w:jc w:val="center"/>
         <w:rPr>
-          <w:rFonts w:ascii="Futura" w:hAnsi="Futura"/>
+          <w:rFonts w:ascii="Futura Std Book" w:hAnsi="Futura Std Book"/>
           <w:i/>
           <w:iCs/>
           <w:sz w:val="20"/>
@@ -2516,7 +2182,7 @@
       <w:pPr>
         <w:jc w:val="center"/>
         <w:rPr>
-          <w:rFonts w:ascii="Futura" w:hAnsi="Futura"/>
+          <w:rFonts w:ascii="Futura Std Book" w:hAnsi="Futura Std Book"/>
           <w:i/>
           <w:iCs/>
           <w:sz w:val="20"/>
@@ -2528,7 +2194,7 @@
       <w:pPr>
         <w:jc w:val="center"/>
         <w:rPr>
-          <w:rFonts w:ascii="Futura" w:hAnsi="Futura"/>
+          <w:rFonts w:ascii="Futura Std Book" w:hAnsi="Futura Std Book"/>
           <w:i/>
           <w:iCs/>
           <w:sz w:val="20"/>
@@ -2537,7 +2203,7 @@
       </w:pPr>
       <w:r>
         <w:rPr>
-          <w:rFonts w:ascii="Futura" w:hAnsi="Futura"/>
+          <w:rFonts w:ascii="Futura Std Book" w:hAnsi="Futura Std Book"/>
           <w:i/>
           <w:iCs/>
           <w:noProof/>
@@ -2582,7 +2248,7 @@
       </w:r>
       <w:r>
         <w:rPr>
-          <w:rFonts w:ascii="Futura" w:hAnsi="Futura"/>
+          <w:rFonts w:ascii="Futura Std Book" w:hAnsi="Futura Std Book"/>
           <w:i/>
           <w:iCs/>
           <w:sz w:val="20"/>
@@ -2596,7 +2262,7 @@
       <w:pPr>
         <w:jc w:val="center"/>
         <w:rPr>
-          <w:rFonts w:ascii="Futura" w:hAnsi="Futura"/>
+          <w:rFonts w:ascii="Futura Std Book" w:hAnsi="Futura Std Book"/>
           <w:i/>
           <w:iCs/>
           <w:sz w:val="20"/>
@@ -2608,79 +2274,7 @@
       <w:pPr>
         <w:jc w:val="center"/>
         <w:rPr>
-          <w:rFonts w:ascii="Futura" w:hAnsi="Futura"/>
-          <w:i/>
-          <w:iCs/>
-          <w:sz w:val="20"/>
-          <w:szCs w:val="20"/>
-        </w:rPr>
-      </w:pPr>
-    </w:p>
-    <w:p>
-      <w:pPr>
-        <w:jc w:val="center"/>
-        <w:rPr>
-          <w:rFonts w:ascii="Futura" w:hAnsi="Futura"/>
-          <w:i/>
-          <w:iCs/>
-          <w:sz w:val="20"/>
-          <w:szCs w:val="20"/>
-        </w:rPr>
-      </w:pPr>
-    </w:p>
-    <w:p>
-      <w:pPr>
-        <w:jc w:val="center"/>
-        <w:rPr>
-          <w:rFonts w:ascii="Futura" w:hAnsi="Futura"/>
-          <w:i/>
-          <w:iCs/>
-          <w:sz w:val="20"/>
-          <w:szCs w:val="20"/>
-        </w:rPr>
-      </w:pPr>
-    </w:p>
-    <w:p>
-      <w:pPr>
-        <w:jc w:val="center"/>
-        <w:rPr>
-          <w:rFonts w:ascii="Futura" w:hAnsi="Futura"/>
-          <w:i/>
-          <w:iCs/>
-          <w:sz w:val="20"/>
-          <w:szCs w:val="20"/>
-        </w:rPr>
-      </w:pPr>
-    </w:p>
-    <w:p>
-      <w:pPr>
-        <w:jc w:val="center"/>
-        <w:rPr>
-          <w:rFonts w:ascii="Futura" w:hAnsi="Futura"/>
-          <w:i/>
-          <w:iCs/>
-          <w:sz w:val="20"/>
-          <w:szCs w:val="20"/>
-        </w:rPr>
-      </w:pPr>
-    </w:p>
-    <w:p>
-      <w:pPr>
-        <w:jc w:val="center"/>
-        <w:rPr>
-          <w:rFonts w:ascii="Futura" w:hAnsi="Futura"/>
-          <w:i/>
-          <w:iCs/>
-          <w:sz w:val="20"/>
-          <w:szCs w:val="20"/>
-        </w:rPr>
-      </w:pPr>
-    </w:p>
-    <w:p>
-      <w:pPr>
-        <w:jc w:val="center"/>
-        <w:rPr>
-          <w:rFonts w:ascii="Futura" w:hAnsi="Futura"/>
+          <w:rFonts w:ascii="Futura Std Book" w:hAnsi="Futura Std Book"/>
           <w:i/>
           <w:iCs/>
           <w:sz w:val="20"/>
@@ -2695,47 +2289,24 @@
           <w:numId w:val="4"/>
         </w:numPr>
         <w:rPr>
-          <w:rFonts w:ascii="Futura" w:hAnsi="Futura"/>
-        </w:rPr>
-      </w:pPr>
-      <w:r>
-        <w:rPr>
-          <w:rFonts w:ascii="Futura" w:hAnsi="Futura"/>
-          <w:b/>
-          <w:bCs/>
-        </w:rPr>
-        <w:lastRenderedPageBreak/>
-        <w:t>Asset Management:</w:t>
-      </w:r>
-      <w:r>
-        <w:rPr>
-          <w:rFonts w:ascii="Futura" w:hAnsi="Futura"/>
-        </w:rPr>
-        <w:t xml:space="preserve"> Use the </w:t>
-      </w:r>
-      <w:r>
-        <w:rPr>
-          <w:rFonts w:ascii="Futura" w:hAnsi="Futura"/>
-          <w:b/>
-          <w:bCs/>
-        </w:rPr>
-        <w:t>Edit Addresses</w:t>
-      </w:r>
-      <w:r>
-        <w:rPr>
-          <w:rFonts w:ascii="Futura" w:hAnsi="Futura"/>
-        </w:rPr>
-        <w:t xml:space="preserve"> (</w:t>
-      </w:r>
-      <w:r>
-        <w:rPr>
-          <w:rFonts w:ascii="Futura" w:hAnsi="Futura"/>
+          <w:rFonts w:ascii="Futura Std Book" w:hAnsi="Futura Std Book"/>
+        </w:rPr>
+      </w:pPr>
+      <w:r>
+        <w:rPr>
+          <w:rFonts w:ascii="Futura Std Book" w:hAnsi="Futura Std Book"/>
+        </w:rPr>
+        <w:t>Asset Management: Use the Edit Addresses (</w:t>
+      </w:r>
+      <w:r>
+        <w:rPr>
+          <w:rFonts w:ascii="Futura Std Book" w:hAnsi="Futura Std Book"/>
         </w:rPr>
         <w:t>click the hamburger menu on the bottom side of the navigation panel</w:t>
       </w:r>
       <w:r>
         <w:rPr>
-          <w:rFonts w:ascii="Futura" w:hAnsi="Futura"/>
+          <w:rFonts w:ascii="Futura Std Book" w:hAnsi="Futura Std Book"/>
         </w:rPr>
         <w:t>) page to modify the list of monitored hardware. The system reads from and writes to local .txt configuration files to keep the monitoring targets dynamic.</w:t>
       </w:r>
@@ -2744,7 +2315,7 @@
       <w:pPr>
         <w:jc w:val="center"/>
         <w:rPr>
-          <w:rFonts w:ascii="Futura" w:hAnsi="Futura"/>
+          <w:rFonts w:ascii="Futura Std Book" w:hAnsi="Futura Std Book"/>
           <w:i/>
           <w:iCs/>
           <w:sz w:val="20"/>
@@ -2753,9 +2324,10 @@
       </w:pPr>
       <w:r>
         <w:rPr>
-          <w:rFonts w:ascii="Futura" w:hAnsi="Futura"/>
+          <w:rFonts w:ascii="Futura Std Book" w:hAnsi="Futura Std Book"/>
           <w:noProof/>
         </w:rPr>
+        <w:lastRenderedPageBreak/>
         <w:drawing>
           <wp:inline distT="0" distB="0" distL="0" distR="0" wp14:anchorId="6A55E091" wp14:editId="40F226CE">
             <wp:extent cx="5943600" cy="3341370"/>
@@ -2794,13 +2366,13 @@
       </w:r>
       <w:r>
         <w:rPr>
-          <w:rFonts w:ascii="Futura" w:hAnsi="Futura"/>
+          <w:rFonts w:ascii="Futura Std Book" w:hAnsi="Futura Std Book"/>
         </w:rPr>
         <w:br/>
       </w:r>
       <w:r>
         <w:rPr>
-          <w:rFonts w:ascii="Futura" w:hAnsi="Futura"/>
+          <w:rFonts w:ascii="Futura Std Book" w:hAnsi="Futura Std Book"/>
           <w:i/>
           <w:iCs/>
           <w:sz w:val="20"/>
@@ -2810,7 +2382,7 @@
       </w:r>
       <w:r>
         <w:rPr>
-          <w:rFonts w:ascii="Futura" w:hAnsi="Futura"/>
+          <w:rFonts w:ascii="Futura Std Book" w:hAnsi="Futura Std Book"/>
           <w:i/>
           <w:iCs/>
           <w:sz w:val="20"/>
@@ -2820,7 +2392,7 @@
       </w:r>
       <w:r>
         <w:rPr>
-          <w:rFonts w:ascii="Futura" w:hAnsi="Futura"/>
+          <w:rFonts w:ascii="Futura Std Book" w:hAnsi="Futura Std Book"/>
           <w:i/>
           <w:iCs/>
           <w:sz w:val="20"/>
@@ -2830,7 +2402,7 @@
       </w:r>
       <w:r>
         <w:rPr>
-          <w:rFonts w:ascii="Futura" w:hAnsi="Futura"/>
+          <w:rFonts w:ascii="Futura Std Book" w:hAnsi="Futura Std Book"/>
           <w:i/>
           <w:iCs/>
           <w:sz w:val="20"/>
@@ -2841,9 +2413,45 @@
     </w:p>
     <w:p>
       <w:pPr>
-        <w:jc w:val="both"/>
-        <w:rPr>
-          <w:rFonts w:ascii="Futura" w:hAnsi="Futura"/>
+        <w:jc w:val="center"/>
+        <w:rPr>
+          <w:rFonts w:ascii="Futura Std Book" w:hAnsi="Futura Std Book"/>
+          <w:i/>
+          <w:iCs/>
+          <w:sz w:val="20"/>
+          <w:szCs w:val="20"/>
+        </w:rPr>
+      </w:pPr>
+    </w:p>
+    <w:p>
+      <w:pPr>
+        <w:jc w:val="center"/>
+        <w:rPr>
+          <w:rFonts w:ascii="Futura Std Book" w:hAnsi="Futura Std Book"/>
+          <w:i/>
+          <w:iCs/>
+          <w:sz w:val="20"/>
+          <w:szCs w:val="20"/>
+        </w:rPr>
+      </w:pPr>
+    </w:p>
+    <w:p>
+      <w:pPr>
+        <w:jc w:val="center"/>
+        <w:rPr>
+          <w:rFonts w:ascii="Futura Std Book" w:hAnsi="Futura Std Book"/>
+          <w:i/>
+          <w:iCs/>
+          <w:sz w:val="20"/>
+          <w:szCs w:val="20"/>
+        </w:rPr>
+      </w:pPr>
+    </w:p>
+    <w:p>
+      <w:pPr>
+        <w:jc w:val="both"/>
+        <w:rPr>
+          <w:rFonts w:ascii="Futura Std Book" w:hAnsi="Futura Std Book"/>
         </w:rPr>
       </w:pPr>
     </w:p>
@@ -2855,64 +2463,36 @@
         </w:numPr>
         <w:jc w:val="both"/>
         <w:rPr>
-          <w:rFonts w:ascii="Futura" w:hAnsi="Futura"/>
-        </w:rPr>
-      </w:pPr>
-      <w:r>
-        <w:rPr>
-          <w:rFonts w:ascii="Futura" w:hAnsi="Futura"/>
-          <w:b/>
-          <w:bCs/>
-        </w:rPr>
-        <w:t>Log Auditing:</w:t>
-      </w:r>
-      <w:r>
-        <w:rPr>
-          <w:rFonts w:ascii="Futura" w:hAnsi="Futura"/>
-        </w:rPr>
-        <w:t xml:space="preserve"> Use </w:t>
-      </w:r>
-      <w:r>
-        <w:rPr>
-          <w:rFonts w:ascii="Futura" w:hAnsi="Futura"/>
-          <w:b/>
-          <w:bCs/>
-        </w:rPr>
-        <w:t xml:space="preserve">Download Logs </w:t>
-      </w:r>
-      <w:r>
-        <w:rPr>
-          <w:rFonts w:ascii="Futura" w:hAnsi="Futura"/>
-        </w:rPr>
-        <w:t>(</w:t>
-      </w:r>
-      <w:r>
-        <w:rPr>
-          <w:rFonts w:ascii="Futura" w:hAnsi="Futura"/>
-        </w:rPr>
-        <w:t>click the hamburger menu on the bottom side of the navigation panel</w:t>
-      </w:r>
-      <w:r>
-        <w:rPr>
-          <w:rFonts w:ascii="Futura" w:hAnsi="Futura"/>
-        </w:rPr>
-        <w:t>)</w:t>
-      </w:r>
-      <w:r>
-        <w:rPr>
-          <w:rFonts w:ascii="Futura" w:hAnsi="Futura"/>
+          <w:rFonts w:ascii="Futura Std Book" w:hAnsi="Futura Std Book"/>
+        </w:rPr>
+      </w:pPr>
+      <w:r>
+        <w:rPr>
+          <w:rFonts w:ascii="Futura Std Book" w:hAnsi="Futura Std Book"/>
+        </w:rPr>
+        <w:t xml:space="preserve">Log Auditing: Use </w:t>
+      </w:r>
+      <w:r>
+        <w:rPr>
+          <w:rFonts w:ascii="Futura Std Book" w:hAnsi="Futura Std Book"/>
+        </w:rPr>
+        <w:t>Download Logs (click the hamburger menu on the bottom side of the navigation panel)</w:t>
+      </w:r>
+      <w:r>
+        <w:rPr>
+          <w:rFonts w:ascii="Futura Std Book" w:hAnsi="Futura Std Book"/>
         </w:rPr>
         <w:t xml:space="preserve"> to </w:t>
       </w:r>
       <w:r>
         <w:rPr>
-          <w:rFonts w:ascii="Futura" w:hAnsi="Futura"/>
+          <w:rFonts w:ascii="Futura Std Book" w:hAnsi="Futura Std Book"/>
         </w:rPr>
         <w:t>download and view</w:t>
       </w:r>
       <w:r>
         <w:rPr>
-          <w:rFonts w:ascii="Futura" w:hAnsi="Futura"/>
+          <w:rFonts w:ascii="Futura Std Book" w:hAnsi="Futura Std Book"/>
         </w:rPr>
         <w:t xml:space="preserve"> historical connectivity logs to identify patterns in network downtime.</w:t>
       </w:r>
@@ -2921,18 +2501,12 @@
       <w:pPr>
         <w:jc w:val="center"/>
         <w:rPr>
-          <w:rFonts w:ascii="Futura" w:hAnsi="Futura"/>
-          <w:i/>
-          <w:iCs/>
-          <w:sz w:val="20"/>
-          <w:szCs w:val="20"/>
-        </w:rPr>
-      </w:pPr>
-      <w:r>
-        <w:rPr>
-          <w:rFonts w:ascii="Futura" w:hAnsi="Futura"/>
-          <w:b/>
-          <w:bCs/>
+          <w:rFonts w:ascii="Futura Std Book" w:hAnsi="Futura Std Book"/>
+        </w:rPr>
+      </w:pPr>
+      <w:r>
+        <w:rPr>
+          <w:rFonts w:ascii="Futura Std Book" w:hAnsi="Futura Std Book"/>
           <w:noProof/>
         </w:rPr>
         <w:drawing>
@@ -2973,13 +2547,13 @@
       </w:r>
       <w:r>
         <w:rPr>
-          <w:rFonts w:ascii="Futura" w:hAnsi="Futura"/>
+          <w:rFonts w:ascii="Futura Std Book" w:hAnsi="Futura Std Book"/>
         </w:rPr>
         <w:br/>
       </w:r>
       <w:r>
         <w:rPr>
-          <w:rFonts w:ascii="Futura" w:hAnsi="Futura"/>
+          <w:rFonts w:ascii="Futura Std Book" w:hAnsi="Futura Std Book"/>
           <w:i/>
           <w:iCs/>
           <w:sz w:val="20"/>
@@ -2990,121 +2564,69 @@
     </w:p>
     <w:p>
       <w:pPr>
+        <w:jc w:val="both"/>
+        <w:rPr>
+          <w:rFonts w:ascii="Futura Std Book" w:hAnsi="Futura Std Book"/>
+          <w:sz w:val="32"/>
+          <w:szCs w:val="40"/>
+        </w:rPr>
+      </w:pPr>
+      <w:r>
+        <w:rPr>
+          <w:rFonts w:ascii="Futura Std Book" w:hAnsi="Futura Std Book"/>
+        </w:rPr>
+        <w:pict w14:anchorId="5536555E">
+          <v:rect id="_x0000_i1102" style="width:0;height:1.5pt" o:hralign="center" o:hrstd="t" o:hr="t" fillcolor="#a0a0a0" stroked="f"/>
+        </w:pict>
+      </w:r>
+    </w:p>
+    <w:p>
+      <w:pPr>
+        <w:jc w:val="both"/>
+        <w:rPr>
+          <w:rFonts w:ascii="Futura Std Book" w:hAnsi="Futura Std Book"/>
+          <w:sz w:val="32"/>
+          <w:szCs w:val="40"/>
+        </w:rPr>
+      </w:pPr>
+      <w:r>
+        <w:rPr>
+          <w:rFonts w:ascii="Futura Std Book" w:hAnsi="Futura Std Book"/>
+          <w:sz w:val="32"/>
+          <w:szCs w:val="40"/>
+        </w:rPr>
+        <w:t>Alert System &amp; Troubleshooting</w:t>
+      </w:r>
+    </w:p>
+    <w:p>
+      <w:pPr>
+        <w:jc w:val="both"/>
+        <w:rPr>
+          <w:rFonts w:ascii="Futura Std Book" w:hAnsi="Futura Std Book"/>
+        </w:rPr>
+      </w:pPr>
+      <w:r>
+        <w:rPr>
+          <w:rFonts w:ascii="Futura Std Book" w:hAnsi="Futura Std Book"/>
+        </w:rPr>
+        <w:lastRenderedPageBreak/>
+        <w:t>The system includes an audio-visual alert mechanism (systemAlert.php) that triggers during critical failures.</w:t>
+      </w:r>
+    </w:p>
+    <w:p>
+      <w:pPr>
         <w:jc w:val="center"/>
         <w:rPr>
-          <w:rFonts w:ascii="Futura" w:hAnsi="Futura"/>
+          <w:rFonts w:ascii="Futura Std Book" w:hAnsi="Futura Std Book"/>
           <w:i/>
           <w:iCs/>
           <w:sz w:val="20"/>
           <w:szCs w:val="20"/>
         </w:rPr>
       </w:pPr>
-    </w:p>
-    <w:p>
-      <w:pPr>
-        <w:jc w:val="center"/>
-        <w:rPr>
-          <w:rFonts w:ascii="Futura" w:hAnsi="Futura"/>
-          <w:i/>
-          <w:iCs/>
-          <w:sz w:val="20"/>
-          <w:szCs w:val="20"/>
-        </w:rPr>
-      </w:pPr>
-    </w:p>
-    <w:p>
-      <w:pPr>
-        <w:jc w:val="center"/>
-        <w:rPr>
-          <w:rFonts w:ascii="Futura" w:hAnsi="Futura"/>
-          <w:i/>
-          <w:iCs/>
-          <w:sz w:val="20"/>
-          <w:szCs w:val="20"/>
-        </w:rPr>
-      </w:pPr>
-    </w:p>
-    <w:p>
-      <w:pPr>
-        <w:jc w:val="center"/>
-        <w:rPr>
-          <w:rFonts w:ascii="Futura" w:hAnsi="Futura"/>
-          <w:b/>
-          <w:bCs/>
-        </w:rPr>
-      </w:pPr>
-    </w:p>
-    <w:p>
-      <w:pPr>
-        <w:jc w:val="both"/>
-        <w:rPr>
-          <w:rFonts w:ascii="Futura" w:hAnsi="Futura"/>
-          <w:b/>
-          <w:bCs/>
-          <w:sz w:val="32"/>
-          <w:szCs w:val="40"/>
-        </w:rPr>
-      </w:pPr>
-      <w:r>
-        <w:rPr>
-          <w:rFonts w:ascii="Futura" w:hAnsi="Futura"/>
-        </w:rPr>
-        <w:lastRenderedPageBreak/>
-        <w:pict w14:anchorId="5536555E">
-          <v:rect id="_x0000_i1030" style="width:0;height:1.5pt" o:hralign="center" o:hrstd="t" o:hr="t" fillcolor="#a0a0a0" stroked="f"/>
-        </w:pict>
-      </w:r>
-    </w:p>
-    <w:p>
-      <w:pPr>
-        <w:jc w:val="both"/>
-        <w:rPr>
-          <w:rFonts w:ascii="Futura" w:hAnsi="Futura"/>
-          <w:b/>
-          <w:bCs/>
-          <w:sz w:val="32"/>
-          <w:szCs w:val="40"/>
-        </w:rPr>
-      </w:pPr>
-      <w:r>
-        <w:rPr>
-          <w:rFonts w:ascii="Futura" w:hAnsi="Futura"/>
-          <w:b/>
-          <w:bCs/>
-          <w:sz w:val="32"/>
-          <w:szCs w:val="40"/>
-        </w:rPr>
-        <w:t>Alert System &amp; Troubleshooting</w:t>
-      </w:r>
-    </w:p>
-    <w:p>
-      <w:pPr>
-        <w:jc w:val="both"/>
-        <w:rPr>
-          <w:rFonts w:ascii="Futura" w:hAnsi="Futura"/>
-        </w:rPr>
-      </w:pPr>
-      <w:r>
-        <w:rPr>
-          <w:rFonts w:ascii="Futura" w:hAnsi="Futura"/>
-        </w:rPr>
-        <w:t>The system includes an audio-visual alert mechanism (systemAlert.php) that triggers during critical failures.</w:t>
-      </w:r>
-    </w:p>
-    <w:p>
-      <w:pPr>
-        <w:jc w:val="center"/>
-        <w:rPr>
-          <w:rFonts w:ascii="Futura" w:hAnsi="Futura"/>
-          <w:i/>
-          <w:iCs/>
-          <w:sz w:val="20"/>
-          <w:szCs w:val="20"/>
-        </w:rPr>
-      </w:pPr>
-      <w:r>
-        <w:rPr>
-          <w:rFonts w:ascii="Futura" w:hAnsi="Futura"/>
+      <w:r>
+        <w:rPr>
+          <w:rFonts w:ascii="Futura Std Book" w:hAnsi="Futura Std Book"/>
           <w:noProof/>
         </w:rPr>
         <w:drawing>
@@ -3145,13 +2667,13 @@
       </w:r>
       <w:r>
         <w:rPr>
-          <w:rFonts w:ascii="Futura" w:hAnsi="Futura"/>
+          <w:rFonts w:ascii="Futura Std Book" w:hAnsi="Futura Std Book"/>
         </w:rPr>
         <w:br/>
       </w:r>
       <w:r>
         <w:rPr>
-          <w:rFonts w:ascii="Futura" w:hAnsi="Futura"/>
+          <w:rFonts w:ascii="Futura Std Book" w:hAnsi="Futura Std Book"/>
           <w:i/>
           <w:iCs/>
           <w:sz w:val="20"/>
@@ -3164,7 +2686,7 @@
       <w:pPr>
         <w:jc w:val="center"/>
         <w:rPr>
-          <w:rFonts w:ascii="Futura" w:hAnsi="Futura"/>
+          <w:rFonts w:ascii="Futura Std Book" w:hAnsi="Futura Std Book"/>
           <w:i/>
           <w:iCs/>
           <w:sz w:val="20"/>
@@ -3174,18 +2696,38 @@
     </w:p>
     <w:p>
       <w:pPr>
-        <w:jc w:val="both"/>
-        <w:rPr>
-          <w:rFonts w:ascii="Futura" w:hAnsi="Futura"/>
-          <w:b/>
-          <w:bCs/>
-        </w:rPr>
-      </w:pPr>
-      <w:r>
-        <w:rPr>
-          <w:rFonts w:ascii="Futura" w:hAnsi="Futura"/>
-          <w:b/>
-          <w:bCs/>
+        <w:jc w:val="center"/>
+        <w:rPr>
+          <w:rFonts w:ascii="Futura Std Book" w:hAnsi="Futura Std Book"/>
+          <w:i/>
+          <w:iCs/>
+          <w:sz w:val="20"/>
+          <w:szCs w:val="20"/>
+        </w:rPr>
+      </w:pPr>
+    </w:p>
+    <w:p>
+      <w:pPr>
+        <w:jc w:val="center"/>
+        <w:rPr>
+          <w:rFonts w:ascii="Futura Std Book" w:hAnsi="Futura Std Book"/>
+          <w:i/>
+          <w:iCs/>
+          <w:sz w:val="20"/>
+          <w:szCs w:val="20"/>
+        </w:rPr>
+      </w:pPr>
+    </w:p>
+    <w:p>
+      <w:pPr>
+        <w:jc w:val="both"/>
+        <w:rPr>
+          <w:rFonts w:ascii="Futura Std Book" w:hAnsi="Futura Std Book"/>
+        </w:rPr>
+      </w:pPr>
+      <w:r>
+        <w:rPr>
+          <w:rFonts w:ascii="Futura Std Book" w:hAnsi="Futura Std Book"/>
         </w:rPr>
         <w:t>If the Alert Triggers:</w:t>
       </w:r>
@@ -3198,22 +2740,14 @@
         </w:numPr>
         <w:jc w:val="both"/>
         <w:rPr>
-          <w:rFonts w:ascii="Futura" w:hAnsi="Futura"/>
-        </w:rPr>
-      </w:pPr>
-      <w:r>
-        <w:rPr>
-          <w:rFonts w:ascii="Futura" w:hAnsi="Futura"/>
-          <w:b/>
-          <w:bCs/>
-        </w:rPr>
-        <w:t>Check XAMPP Services:</w:t>
-      </w:r>
-      <w:r>
-        <w:rPr>
-          <w:rFonts w:ascii="Futura" w:hAnsi="Futura"/>
-        </w:rPr>
-        <w:t xml:space="preserve"> Ensure both Apache and MySQL are running.</w:t>
+          <w:rFonts w:ascii="Futura Std Book" w:hAnsi="Futura Std Book"/>
+        </w:rPr>
+      </w:pPr>
+      <w:r>
+        <w:rPr>
+          <w:rFonts w:ascii="Futura Std Book" w:hAnsi="Futura Std Book"/>
+        </w:rPr>
+        <w:t>Check XAMPP Services: Ensure both Apache and MySQL are running.</w:t>
       </w:r>
     </w:p>
     <w:p>
@@ -3224,22 +2758,14 @@
         </w:numPr>
         <w:jc w:val="both"/>
         <w:rPr>
-          <w:rFonts w:ascii="Futura" w:hAnsi="Futura"/>
-        </w:rPr>
-      </w:pPr>
-      <w:r>
-        <w:rPr>
-          <w:rFonts w:ascii="Futura" w:hAnsi="Futura"/>
-          <w:b/>
-          <w:bCs/>
-        </w:rPr>
-        <w:t>Verify exec() Permissions:</w:t>
-      </w:r>
-      <w:r>
-        <w:rPr>
-          <w:rFonts w:ascii="Futura" w:hAnsi="Futura"/>
-        </w:rPr>
-        <w:t xml:space="preserve"> The backend uses the PHP exec() command to run system pings. Ensure this is not disabled in your php.ini file.</w:t>
+          <w:rFonts w:ascii="Futura Std Book" w:hAnsi="Futura Std Book"/>
+        </w:rPr>
+      </w:pPr>
+      <w:r>
+        <w:rPr>
+          <w:rFonts w:ascii="Futura Std Book" w:hAnsi="Futura Std Book"/>
+        </w:rPr>
+        <w:t>Verify exec() Permissions: The backend uses the PHP exec() command to run system pings. Ensure this is not disabled in your php.ini file.</w:t>
       </w:r>
     </w:p>
     <w:p>
@@ -3250,22 +2776,14 @@
         </w:numPr>
         <w:jc w:val="both"/>
         <w:rPr>
-          <w:rFonts w:ascii="Futura" w:hAnsi="Futura"/>
-        </w:rPr>
-      </w:pPr>
-      <w:r>
-        <w:rPr>
-          <w:rFonts w:ascii="Futura" w:hAnsi="Futura"/>
-          <w:b/>
-          <w:bCs/>
-        </w:rPr>
-        <w:t>Network Scope:</w:t>
-      </w:r>
-      <w:r>
-        <w:rPr>
-          <w:rFonts w:ascii="Futura" w:hAnsi="Futura"/>
-        </w:rPr>
-        <w:t xml:space="preserve"> Ensure the server hosting the app is on a network segment that can "reach" the target IPs (Servers, Switches, Biometrics).</w:t>
+          <w:rFonts w:ascii="Futura Std Book" w:hAnsi="Futura Std Book"/>
+        </w:rPr>
+      </w:pPr>
+      <w:r>
+        <w:rPr>
+          <w:rFonts w:ascii="Futura Std Book" w:hAnsi="Futura Std Book"/>
+        </w:rPr>
+        <w:t>Network Scope: Ensure the server hosting the app is on a network segment that can "reach" the target IPs (Servers, Switches, Biometrics).</w:t>
       </w:r>
     </w:p>
     <w:p>
@@ -3276,85 +2794,22 @@
         </w:numPr>
         <w:jc w:val="both"/>
         <w:rPr>
-          <w:rFonts w:ascii="Futura" w:hAnsi="Futura"/>
-        </w:rPr>
-      </w:pPr>
-      <w:r>
-        <w:rPr>
-          <w:rFonts w:ascii="Futura" w:hAnsi="Futura"/>
-          <w:b/>
-          <w:bCs/>
-        </w:rPr>
-        <w:t>Host Network Connectivity:</w:t>
-      </w:r>
-      <w:r>
-        <w:rPr>
-          <w:rFonts w:ascii="Futura" w:hAnsi="Futura"/>
-        </w:rPr>
-        <w:t xml:space="preserve"> Check if host device is connected to a valid network connection</w:t>
-      </w:r>
-    </w:p>
-    <w:p>
-      <w:pPr>
-        <w:jc w:val="both"/>
-        <w:rPr>
-          <w:rFonts w:ascii="Futura" w:hAnsi="Futura"/>
-        </w:rPr>
-      </w:pPr>
-    </w:p>
-    <w:p>
-      <w:pPr>
-        <w:jc w:val="both"/>
-        <w:rPr>
-          <w:rFonts w:ascii="Futura" w:hAnsi="Futura"/>
-        </w:rPr>
-      </w:pPr>
-    </w:p>
-    <w:p>
-      <w:pPr>
-        <w:jc w:val="both"/>
-        <w:rPr>
-          <w:rFonts w:ascii="Futura" w:hAnsi="Futura"/>
-        </w:rPr>
-      </w:pPr>
-    </w:p>
-    <w:p>
-      <w:pPr>
-        <w:jc w:val="both"/>
-        <w:rPr>
-          <w:rFonts w:ascii="Futura" w:hAnsi="Futura"/>
-        </w:rPr>
-      </w:pPr>
-    </w:p>
-    <w:p>
-      <w:pPr>
-        <w:jc w:val="both"/>
-        <w:rPr>
-          <w:rFonts w:ascii="Futura" w:hAnsi="Futura"/>
-        </w:rPr>
-      </w:pPr>
-    </w:p>
-    <w:p>
-      <w:pPr>
-        <w:jc w:val="both"/>
-        <w:rPr>
-          <w:rFonts w:ascii="Futura" w:hAnsi="Futura"/>
-        </w:rPr>
-      </w:pPr>
-    </w:p>
-    <w:p>
-      <w:pPr>
-        <w:jc w:val="both"/>
-        <w:rPr>
-          <w:rFonts w:ascii="Futura" w:hAnsi="Futura"/>
-        </w:rPr>
-      </w:pPr>
-    </w:p>
-    <w:p>
-      <w:pPr>
-        <w:jc w:val="both"/>
-        <w:rPr>
-          <w:rFonts w:ascii="Futura" w:hAnsi="Futura"/>
+          <w:rFonts w:ascii="Futura Std Book" w:hAnsi="Futura Std Book"/>
+        </w:rPr>
+      </w:pPr>
+      <w:r>
+        <w:rPr>
+          <w:rFonts w:ascii="Futura Std Book" w:hAnsi="Futura Std Book"/>
+        </w:rPr>
+        <w:t>Host Network Connectivity: Check if host device is connected to a valid network connection</w:t>
+      </w:r>
+    </w:p>
+    <w:p>
+      <w:pPr>
+        <w:ind w:left="360"/>
+        <w:jc w:val="both"/>
+        <w:rPr>
+          <w:rFonts w:ascii="Futura Std Book" w:hAnsi="Futura Std Book"/>
         </w:rPr>
       </w:pPr>
     </w:p>
@@ -3363,31 +2818,30 @@
         <w:ind w:firstLine="720"/>
         <w:jc w:val="both"/>
         <w:rPr>
-          <w:rFonts w:ascii="Futura" w:hAnsi="Futura"/>
-        </w:rPr>
-      </w:pPr>
-      <w:r>
-        <w:rPr>
-          <w:rFonts w:ascii="Futura" w:hAnsi="Futura"/>
-        </w:rPr>
-        <w:lastRenderedPageBreak/>
+          <w:rFonts w:ascii="Futura Std Book" w:hAnsi="Futura Std Book"/>
+        </w:rPr>
+      </w:pPr>
+      <w:r>
+        <w:rPr>
+          <w:rFonts w:ascii="Futura Std Book" w:hAnsi="Futura Std Book"/>
+        </w:rPr>
         <w:t>The system also plays a short two-beep alarm when an ip returned as timed out</w:t>
       </w:r>
       <w:r>
         <w:rPr>
-          <w:rFonts w:ascii="Futura" w:hAnsi="Futura"/>
+          <w:rFonts w:ascii="Futura Std Book" w:hAnsi="Futura Std Book"/>
         </w:rPr>
         <w:t xml:space="preserve"> </w:t>
       </w:r>
       <w:r>
         <w:rPr>
-          <w:rFonts w:ascii="Futura" w:hAnsi="Futura"/>
+          <w:rFonts w:ascii="Futura Std Book" w:hAnsi="Futura Std Book"/>
         </w:rPr>
         <w:t>or network status changed from online to offline.</w:t>
       </w:r>
       <w:r>
         <w:rPr>
-          <w:rFonts w:ascii="Futura" w:hAnsi="Futura"/>
+          <w:rFonts w:ascii="Futura Std Book" w:hAnsi="Futura Std Book"/>
         </w:rPr>
         <w:t xml:space="preserve"> Number of offline devices is represented by a number badge</w:t>
       </w:r>
@@ -3396,7 +2850,7 @@
       <w:pPr>
         <w:jc w:val="center"/>
         <w:rPr>
-          <w:rFonts w:ascii="Futura" w:hAnsi="Futura"/>
+          <w:rFonts w:ascii="Futura Std Book" w:hAnsi="Futura Std Book"/>
           <w:i/>
           <w:iCs/>
           <w:sz w:val="20"/>
@@ -3405,9 +2859,10 @@
       </w:pPr>
       <w:r>
         <w:rPr>
-          <w:rFonts w:ascii="Futura" w:hAnsi="Futura"/>
+          <w:rFonts w:ascii="Futura Std Book" w:hAnsi="Futura Std Book"/>
           <w:noProof/>
         </w:rPr>
+        <w:lastRenderedPageBreak/>
         <w:drawing>
           <wp:inline distT="0" distB="0" distL="0" distR="0" wp14:anchorId="38E7BDFC" wp14:editId="257059F5">
             <wp:extent cx="5943600" cy="3341370"/>
@@ -3446,13 +2901,13 @@
       </w:r>
       <w:r>
         <w:rPr>
-          <w:rFonts w:ascii="Futura" w:hAnsi="Futura"/>
+          <w:rFonts w:ascii="Futura Std Book" w:hAnsi="Futura Std Book"/>
         </w:rPr>
         <w:br/>
       </w:r>
       <w:r>
         <w:rPr>
-          <w:rFonts w:ascii="Futura" w:hAnsi="Futura"/>
+          <w:rFonts w:ascii="Futura Std Book" w:hAnsi="Futura Std Book"/>
           <w:i/>
           <w:iCs/>
           <w:sz w:val="20"/>
@@ -3465,15 +2920,15 @@
       <w:pPr>
         <w:jc w:val="both"/>
         <w:rPr>
-          <w:rFonts w:ascii="Futura" w:hAnsi="Futura"/>
-        </w:rPr>
-      </w:pPr>
-      <w:r>
-        <w:rPr>
-          <w:rFonts w:ascii="Futura" w:hAnsi="Futura"/>
+          <w:rFonts w:ascii="Futura Std Book" w:hAnsi="Futura Std Book"/>
+        </w:rPr>
+      </w:pPr>
+      <w:r>
+        <w:rPr>
+          <w:rFonts w:ascii="Futura Std Book" w:hAnsi="Futura Std Book"/>
         </w:rPr>
         <w:pict w14:anchorId="6A6D7843">
-          <v:rect id="_x0000_i1031" style="width:0;height:1.5pt" o:hralign="center" o:hrstd="t" o:hr="t" fillcolor="#a0a0a0" stroked="f"/>
+          <v:rect id="_x0000_i1103" style="width:0;height:1.5pt" o:hralign="center" o:hrstd="t" o:hr="t" fillcolor="#a0a0a0" stroked="f"/>
         </w:pict>
       </w:r>
     </w:p>
@@ -3481,18 +2936,14 @@
       <w:pPr>
         <w:jc w:val="both"/>
         <w:rPr>
-          <w:rFonts w:ascii="Futura" w:hAnsi="Futura"/>
-          <w:b/>
-          <w:bCs/>
+          <w:rFonts w:ascii="Futura Std Book" w:hAnsi="Futura Std Book"/>
           <w:sz w:val="32"/>
           <w:szCs w:val="40"/>
         </w:rPr>
       </w:pPr>
       <w:r>
         <w:rPr>
-          <w:rFonts w:ascii="Futura" w:hAnsi="Futura"/>
-          <w:b/>
-          <w:bCs/>
+          <w:rFonts w:ascii="Futura Std Book" w:hAnsi="Futura Std Book"/>
           <w:sz w:val="32"/>
           <w:szCs w:val="40"/>
         </w:rPr>
@@ -3507,44 +2958,36 @@
         </w:numPr>
         <w:jc w:val="both"/>
         <w:rPr>
-          <w:rFonts w:ascii="Futura" w:hAnsi="Futura"/>
-        </w:rPr>
-      </w:pPr>
-      <w:r>
-        <w:rPr>
-          <w:rFonts w:ascii="Futura" w:hAnsi="Futura"/>
-          <w:b/>
-          <w:bCs/>
-        </w:rPr>
-        <w:t>Auto-Logout:</w:t>
-      </w:r>
-      <w:r>
-        <w:rPr>
-          <w:rFonts w:ascii="Futura" w:hAnsi="Futura"/>
-        </w:rPr>
-        <w:t xml:space="preserve"> A "Heartbeat" script (userHeartbeat.js) monitors admin activity. If the browser tab is </w:t>
-      </w:r>
-      <w:r>
-        <w:rPr>
-          <w:rFonts w:ascii="Futura" w:hAnsi="Futura"/>
+          <w:rFonts w:ascii="Futura Std Book" w:hAnsi="Futura Std Book"/>
+        </w:rPr>
+      </w:pPr>
+      <w:r>
+        <w:rPr>
+          <w:rFonts w:ascii="Futura Std Book" w:hAnsi="Futura Std Book"/>
+        </w:rPr>
+        <w:t xml:space="preserve">Auto-Logout: A "Heartbeat" script (userHeartbeat.js) monitors admin activity. If the browser tab is </w:t>
+      </w:r>
+      <w:r>
+        <w:rPr>
+          <w:rFonts w:ascii="Futura Std Book" w:hAnsi="Futura Std Book"/>
         </w:rPr>
         <w:t>closed</w:t>
       </w:r>
       <w:r>
         <w:rPr>
-          <w:rFonts w:ascii="Futura" w:hAnsi="Futura"/>
+          <w:rFonts w:ascii="Futura Std Book" w:hAnsi="Futura Std Book"/>
         </w:rPr>
         <w:t xml:space="preserve"> and inactive for 15 seconds, the session is destroyed </w:t>
       </w:r>
       <w:r>
         <w:rPr>
-          <w:rFonts w:ascii="Futura" w:hAnsi="Futura"/>
+          <w:rFonts w:ascii="Futura Std Book" w:hAnsi="Futura Std Book"/>
         </w:rPr>
         <w:t xml:space="preserve">and user is automatically logged out </w:t>
       </w:r>
       <w:r>
         <w:rPr>
-          <w:rFonts w:ascii="Futura" w:hAnsi="Futura"/>
+          <w:rFonts w:ascii="Futura Std Book" w:hAnsi="Futura Std Book"/>
         </w:rPr>
         <w:t>for security.</w:t>
       </w:r>
@@ -3557,37 +3000,29 @@
         </w:numPr>
         <w:jc w:val="both"/>
         <w:rPr>
-          <w:rFonts w:ascii="Futura" w:hAnsi="Futura"/>
-        </w:rPr>
-      </w:pPr>
-      <w:r>
-        <w:rPr>
-          <w:rFonts w:ascii="Futura" w:hAnsi="Futura"/>
-          <w:b/>
-          <w:bCs/>
-        </w:rPr>
-        <w:t>System Watchdog:</w:t>
-      </w:r>
-      <w:r>
-        <w:rPr>
-          <w:rFonts w:ascii="Futura" w:hAnsi="Futura"/>
-        </w:rPr>
-        <w:t xml:space="preserve"> A background script (systemWatchdog.js) ensures the application logic remains active and alerts the IT admin if the monitoring process stalls.</w:t>
-      </w:r>
-    </w:p>
-    <w:p>
-      <w:pPr>
-        <w:jc w:val="both"/>
-        <w:rPr>
-          <w:rFonts w:ascii="Futura" w:hAnsi="Futura"/>
-        </w:rPr>
-      </w:pPr>
-      <w:r>
-        <w:rPr>
-          <w:rFonts w:ascii="Futura" w:hAnsi="Futura"/>
+          <w:rFonts w:ascii="Futura Std Book" w:hAnsi="Futura Std Book"/>
+        </w:rPr>
+      </w:pPr>
+      <w:r>
+        <w:rPr>
+          <w:rFonts w:ascii="Futura Std Book" w:hAnsi="Futura Std Book"/>
+        </w:rPr>
+        <w:t>System Watchdog: A background script (systemWatchdog.js) ensures the application logic remains active and alerts the IT admin if the monitoring process stalls.</w:t>
+      </w:r>
+    </w:p>
+    <w:p>
+      <w:pPr>
+        <w:jc w:val="both"/>
+        <w:rPr>
+          <w:rFonts w:ascii="Futura Std Book" w:hAnsi="Futura Std Book"/>
+        </w:rPr>
+      </w:pPr>
+      <w:r>
+        <w:rPr>
+          <w:rFonts w:ascii="Futura Std Book" w:hAnsi="Futura Std Book"/>
         </w:rPr>
         <w:pict w14:anchorId="04ABA013">
-          <v:rect id="_x0000_i1032" style="width:0;height:1.5pt" o:hralign="center" o:hrstd="t" o:hr="t" fillcolor="#a0a0a0" stroked="f"/>
+          <v:rect id="_x0000_i1104" style="width:0;height:1.5pt" o:hralign="center" o:hrstd="t" o:hr="t" fillcolor="#a0a0a0" stroked="f"/>
         </w:pict>
       </w:r>
     </w:p>
@@ -3595,44 +3030,36 @@
       <w:pPr>
         <w:jc w:val="both"/>
         <w:rPr>
-          <w:rFonts w:ascii="Futura" w:hAnsi="Futura"/>
-        </w:rPr>
-      </w:pPr>
-      <w:r>
-        <w:rPr>
-          <w:rFonts w:ascii="Futura" w:hAnsi="Futura"/>
-          <w:b/>
-          <w:bCs/>
-        </w:rPr>
-        <w:t>Note:</w:t>
-      </w:r>
-      <w:r>
-        <w:rPr>
-          <w:rFonts w:ascii="Futura" w:hAnsi="Futura"/>
-        </w:rPr>
-        <w:t xml:space="preserve"> When migrating to a permanent company server, ensure the folder permissions allow the web server (Apache) to write to the local text files and the database directory.</w:t>
-      </w:r>
-    </w:p>
-    <w:p>
-      <w:pPr>
-        <w:jc w:val="both"/>
-        <w:rPr>
-          <w:rFonts w:ascii="Futura" w:hAnsi="Futura"/>
-        </w:rPr>
-      </w:pPr>
-      <w:r>
-        <w:rPr>
-          <w:rFonts w:ascii="Futura" w:hAnsi="Futura"/>
+          <w:rFonts w:ascii="Futura Std Book" w:hAnsi="Futura Std Book"/>
+        </w:rPr>
+      </w:pPr>
+      <w:r>
+        <w:rPr>
+          <w:rFonts w:ascii="Futura Std Book" w:hAnsi="Futura Std Book"/>
+        </w:rPr>
+        <w:t>Note: When migrating to a permanent company server, ensure the folder permissions allow the web server (Apache) to write to the local text files and the database directory.</w:t>
+      </w:r>
+    </w:p>
+    <w:p>
+      <w:pPr>
+        <w:jc w:val="both"/>
+        <w:rPr>
+          <w:rFonts w:ascii="Futura Std Book" w:hAnsi="Futura Std Book"/>
+        </w:rPr>
+      </w:pPr>
+      <w:r>
+        <w:rPr>
+          <w:rFonts w:ascii="Futura Std Book" w:hAnsi="Futura Std Book"/>
         </w:rPr>
         <w:pict w14:anchorId="49AAC10A">
-          <v:rect id="_x0000_i1033" style="width:0;height:1.5pt" o:hralign="center" o:hrstd="t" o:hr="t" fillcolor="#a0a0a0" stroked="f"/>
+          <v:rect id="_x0000_i1105" style="width:0;height:1.5pt" o:hralign="center" o:hrstd="t" o:hr="t" fillcolor="#a0a0a0" stroked="f"/>
         </w:pict>
       </w:r>
     </w:p>
     <w:p>
       <w:pPr>
         <w:rPr>
-          <w:rFonts w:ascii="Futura" w:hAnsi="Futura"/>
+          <w:rFonts w:ascii="Futura Std Book" w:hAnsi="Futura Std Book"/>
         </w:rPr>
       </w:pPr>
     </w:p>
@@ -3710,8 +3137,6 @@
     </w:pPr>
     <w:r>
       <w:rPr>
-        <w:b/>
-        <w:bCs/>
         <w:noProof/>
         <w:sz w:val="52"/>
         <w:szCs w:val="52"/>
@@ -3777,19 +3202,16 @@
     <w:pPr>
       <w:jc w:val="center"/>
       <w:rPr>
-        <w:b/>
-        <w:bCs/>
-        <w:sz w:val="52"/>
-        <w:szCs w:val="52"/>
+        <w:rFonts w:ascii="Futura Std Book" w:hAnsi="Futura Std Book"/>
+        <w:sz w:val="48"/>
+        <w:szCs w:val="48"/>
       </w:rPr>
     </w:pPr>
     <w:r>
       <w:rPr>
-        <w:rFonts w:ascii="Futura" w:hAnsi="Futura"/>
-        <w:b/>
-        <w:bCs/>
-        <w:sz w:val="44"/>
-        <w:szCs w:val="36"/>
+        <w:rFonts w:ascii="Futura Std Book" w:hAnsi="Futura Std Book"/>
+        <w:sz w:val="40"/>
+        <w:szCs w:val="32"/>
       </w:rPr>
       <w:t>Hayakawa Electronics (Phils.) Corp</w:t>
     </w:r>

</xml_diff>